<commit_message>
Address fixed and Phone number fixed
</commit_message>
<xml_diff>
--- a/Tarun-Kumar-Software-Developer-CV.docx
+++ b/Tarun-Kumar-Software-Developer-CV.docx
@@ -1040,6 +1040,7 @@
               </w:rPr>
               <w:t xml:space="preserve">, </w:t>
             </w:r>
+            <w:proofErr w:type="spellStart"/>
             <w:r>
               <w:rPr>
                 <w:rFonts w:ascii="Calibri" w:hAnsi="Calibri" w:cs="Calibri"/>
@@ -1051,6 +1052,7 @@
               </w:rPr>
               <w:t>FutureWorks</w:t>
             </w:r>
+            <w:proofErr w:type="spellEnd"/>
           </w:p>
           <w:p>
             <w:pPr>
@@ -1273,6 +1275,7 @@
               </w:rPr>
               <w:t xml:space="preserve">Sr. PHP Developer, </w:t>
             </w:r>
+            <w:proofErr w:type="spellStart"/>
             <w:r>
               <w:rPr>
                 <w:rFonts w:ascii="Calibri" w:hAnsi="Calibri" w:cs="Calibri"/>
@@ -1284,6 +1287,7 @@
               </w:rPr>
               <w:t>Softweaver</w:t>
             </w:r>
+            <w:proofErr w:type="spellEnd"/>
             <w:r>
               <w:rPr>
                 <w:rFonts w:ascii="Calibri" w:hAnsi="Calibri" w:cs="Calibri"/>
@@ -1960,7 +1964,25 @@
                 <w:sz w:val="20"/>
                 <w:szCs w:val="20"/>
               </w:rPr>
-              <w:t xml:space="preserve">+1-904-1381-050      </w:t>
+              <w:t>+</w:t>
+            </w:r>
+            <w:r>
+              <w:rPr>
+                <w:rFonts w:ascii="Calibri" w:hAnsi="Calibri" w:cs="Calibri"/>
+                <w:color w:val="auto"/>
+                <w:sz w:val="20"/>
+                <w:szCs w:val="20"/>
+              </w:rPr>
+              <w:t>9</w:t>
+            </w:r>
+            <w:r>
+              <w:rPr>
+                <w:rFonts w:ascii="Calibri" w:hAnsi="Calibri" w:cs="Calibri"/>
+                <w:color w:val="auto"/>
+                <w:sz w:val="20"/>
+                <w:szCs w:val="20"/>
+              </w:rPr>
+              <w:t xml:space="preserve">1-904-1381-050      </w:t>
             </w:r>
             <w:r>
               <w:rPr>
@@ -2286,6 +2308,7 @@
                 <w:spacing w:val="-4"/>
               </w:rPr>
             </w:pPr>
+            <w:proofErr w:type="gramStart"/>
             <w:r>
               <w:rPr>
                 <w:rFonts w:ascii="Calibri" w:hAnsi="Calibri" w:cs="Calibri"/>
@@ -2294,6 +2317,7 @@
               </w:rPr>
               <w:t>Master in Computer Science</w:t>
             </w:r>
+            <w:proofErr w:type="gramEnd"/>
           </w:p>
           <w:p>
             <w:pPr>
@@ -2369,6 +2393,7 @@
                 <w:spacing w:val="-4"/>
               </w:rPr>
             </w:pPr>
+            <w:proofErr w:type="gramStart"/>
             <w:r>
               <w:rPr>
                 <w:rFonts w:ascii="Calibri" w:hAnsi="Calibri" w:cs="Calibri"/>
@@ -2377,6 +2402,7 @@
               </w:rPr>
               <w:t>Master in Computer Applications</w:t>
             </w:r>
+            <w:proofErr w:type="gramEnd"/>
           </w:p>
           <w:p>
             <w:pPr>
@@ -2902,6 +2928,7 @@
                       <w:szCs w:val="20"/>
                     </w:rPr>
                   </w:pPr>
+                  <w:proofErr w:type="spellStart"/>
                   <w:r>
                     <w:rPr>
                       <w:rFonts w:ascii="Calibri" w:hAnsi="Calibri" w:cs="Calibri"/>
@@ -2910,6 +2937,7 @@
                     </w:rPr>
                     <w:t>ReactJs</w:t>
                   </w:r>
+                  <w:proofErr w:type="spellEnd"/>
                 </w:p>
               </w:tc>
               <w:tc>
@@ -3642,43 +3670,256 @@
                 <w:b/>
                 <w:bCs/>
                 <w:color w:val="auto"/>
-                <w:spacing w:val="-2"/>
                 <w:sz w:val="24"/>
                 <w:szCs w:val="24"/>
               </w:rPr>
-              <w:t>Corresponding Address</w:t>
-            </w:r>
-          </w:p>
+              <w:t>Personal Information</w:t>
+            </w:r>
+          </w:p>
+          <w:tbl>
+            <w:tblPr>
+              <w:tblStyle w:val="TableGrid"/>
+              <w:tblW w:w="0" w:type="auto"/>
+              <w:tblInd w:w="29" w:type="dxa"/>
+              <w:tblBorders>
+                <w:top w:val="none" w:sz="0" w:space="0" w:color="auto"/>
+                <w:left w:val="none" w:sz="0" w:space="0" w:color="auto"/>
+                <w:bottom w:val="none" w:sz="0" w:space="0" w:color="auto"/>
+                <w:right w:val="none" w:sz="0" w:space="0" w:color="auto"/>
+                <w:insideH w:val="none" w:sz="0" w:space="0" w:color="auto"/>
+                <w:insideV w:val="none" w:sz="0" w:space="0" w:color="auto"/>
+              </w:tblBorders>
+              <w:tblLook w:val="04A0" w:firstRow="1" w:lastRow="0" w:firstColumn="1" w:lastColumn="0" w:noHBand="0" w:noVBand="1"/>
+            </w:tblPr>
+            <w:tblGrid>
+              <w:gridCol w:w="3016"/>
+              <w:gridCol w:w="3240"/>
+            </w:tblGrid>
+            <w:tr>
+              <w:tc>
+                <w:tcPr>
+                  <w:tcW w:w="3016" w:type="dxa"/>
+                </w:tcPr>
+                <w:p>
+                  <w:pPr>
+                    <w:pStyle w:val="BodyText"/>
+                    <w:spacing w:line="312" w:lineRule="auto"/>
+                    <w:rPr>
+                      <w:rFonts w:ascii="Calibri" w:hAnsi="Calibri" w:cs="Calibri"/>
+                      <w:spacing w:val="-4"/>
+                      <w:sz w:val="20"/>
+                      <w:szCs w:val="20"/>
+                    </w:rPr>
+                  </w:pPr>
+                  <w:r>
+                    <w:rPr>
+                      <w:rFonts w:ascii="Calibri" w:hAnsi="Calibri" w:cs="Calibri"/>
+                      <w:spacing w:val="-4"/>
+                      <w:sz w:val="20"/>
+                      <w:szCs w:val="20"/>
+                    </w:rPr>
+                    <w:t xml:space="preserve">Father’s </w:t>
+                  </w:r>
+                  <w:proofErr w:type="gramStart"/>
+                  <w:r>
+                    <w:rPr>
+                      <w:rFonts w:ascii="Calibri" w:hAnsi="Calibri" w:cs="Calibri"/>
+                      <w:spacing w:val="-4"/>
+                      <w:sz w:val="20"/>
+                      <w:szCs w:val="20"/>
+                    </w:rPr>
+                    <w:t>Name :</w:t>
+                  </w:r>
+                  <w:proofErr w:type="gramEnd"/>
+                </w:p>
+              </w:tc>
+              <w:tc>
+                <w:tcPr>
+                  <w:tcW w:w="3240" w:type="dxa"/>
+                </w:tcPr>
+                <w:p>
+                  <w:pPr>
+                    <w:pStyle w:val="BodyText"/>
+                    <w:spacing w:line="312" w:lineRule="auto"/>
+                    <w:rPr>
+                      <w:rFonts w:ascii="Calibri" w:hAnsi="Calibri" w:cs="Calibri"/>
+                      <w:spacing w:val="-4"/>
+                      <w:sz w:val="20"/>
+                      <w:szCs w:val="20"/>
+                    </w:rPr>
+                  </w:pPr>
+                  <w:r>
+                    <w:rPr>
+                      <w:rFonts w:ascii="Calibri" w:hAnsi="Calibri" w:cs="Calibri"/>
+                      <w:spacing w:val="-4"/>
+                      <w:sz w:val="20"/>
+                      <w:szCs w:val="20"/>
+                    </w:rPr>
+                    <w:t>Sh. Om Parkash</w:t>
+                  </w:r>
+                </w:p>
+              </w:tc>
+            </w:tr>
+            <w:tr>
+              <w:tc>
+                <w:tcPr>
+                  <w:tcW w:w="3016" w:type="dxa"/>
+                </w:tcPr>
+                <w:p>
+                  <w:pPr>
+                    <w:pStyle w:val="BodyText"/>
+                    <w:spacing w:line="312" w:lineRule="auto"/>
+                    <w:rPr>
+                      <w:rFonts w:ascii="Calibri" w:hAnsi="Calibri" w:cs="Calibri"/>
+                      <w:spacing w:val="-4"/>
+                      <w:sz w:val="20"/>
+                      <w:szCs w:val="20"/>
+                    </w:rPr>
+                  </w:pPr>
+                  <w:r>
+                    <w:rPr>
+                      <w:rFonts w:ascii="Calibri" w:hAnsi="Calibri" w:cs="Calibri"/>
+                      <w:spacing w:val="-4"/>
+                      <w:sz w:val="20"/>
+                      <w:szCs w:val="20"/>
+                    </w:rPr>
+                    <w:t xml:space="preserve">Marital </w:t>
+                  </w:r>
+                  <w:proofErr w:type="gramStart"/>
+                  <w:r>
+                    <w:rPr>
+                      <w:rFonts w:ascii="Calibri" w:hAnsi="Calibri" w:cs="Calibri"/>
+                      <w:spacing w:val="-4"/>
+                      <w:sz w:val="20"/>
+                      <w:szCs w:val="20"/>
+                    </w:rPr>
+                    <w:t>Status  :</w:t>
+                  </w:r>
+                  <w:proofErr w:type="gramEnd"/>
+                </w:p>
+              </w:tc>
+              <w:tc>
+                <w:tcPr>
+                  <w:tcW w:w="3240" w:type="dxa"/>
+                </w:tcPr>
+                <w:p>
+                  <w:pPr>
+                    <w:pStyle w:val="BodyText"/>
+                    <w:spacing w:line="312" w:lineRule="auto"/>
+                    <w:rPr>
+                      <w:rFonts w:ascii="Calibri" w:hAnsi="Calibri" w:cs="Calibri"/>
+                      <w:spacing w:val="-4"/>
+                      <w:sz w:val="20"/>
+                      <w:szCs w:val="20"/>
+                    </w:rPr>
+                  </w:pPr>
+                  <w:r>
+                    <w:rPr>
+                      <w:rFonts w:ascii="Calibri" w:hAnsi="Calibri" w:cs="Calibri"/>
+                      <w:spacing w:val="-4"/>
+                      <w:sz w:val="20"/>
+                      <w:szCs w:val="20"/>
+                    </w:rPr>
+                    <w:t>Married</w:t>
+                  </w:r>
+                </w:p>
+              </w:tc>
+            </w:tr>
+            <w:tr>
+              <w:tc>
+                <w:tcPr>
+                  <w:tcW w:w="3016" w:type="dxa"/>
+                </w:tcPr>
+                <w:p>
+                  <w:pPr>
+                    <w:pStyle w:val="BodyText"/>
+                    <w:spacing w:line="312" w:lineRule="auto"/>
+                    <w:rPr>
+                      <w:rFonts w:ascii="Calibri" w:hAnsi="Calibri" w:cs="Calibri"/>
+                      <w:spacing w:val="-4"/>
+                      <w:sz w:val="20"/>
+                      <w:szCs w:val="20"/>
+                    </w:rPr>
+                  </w:pPr>
+                  <w:r>
+                    <w:rPr>
+                      <w:rFonts w:ascii="Calibri" w:hAnsi="Calibri" w:cs="Calibri"/>
+                      <w:spacing w:val="-4"/>
+                      <w:sz w:val="20"/>
+                      <w:szCs w:val="20"/>
+                    </w:rPr>
+                    <w:t xml:space="preserve">Correspondence </w:t>
+                  </w:r>
+                  <w:proofErr w:type="gramStart"/>
+                  <w:r>
+                    <w:rPr>
+                      <w:rFonts w:ascii="Calibri" w:hAnsi="Calibri" w:cs="Calibri"/>
+                      <w:spacing w:val="-4"/>
+                      <w:sz w:val="20"/>
+                      <w:szCs w:val="20"/>
+                    </w:rPr>
+                    <w:t>Address :</w:t>
+                  </w:r>
+                  <w:proofErr w:type="gramEnd"/>
+                </w:p>
+              </w:tc>
+              <w:tc>
+                <w:tcPr>
+                  <w:tcW w:w="3240" w:type="dxa"/>
+                </w:tcPr>
+                <w:p>
+                  <w:pPr>
+                    <w:pStyle w:val="BodyText"/>
+                    <w:rPr>
+                      <w:rFonts w:ascii="Calibri" w:hAnsi="Calibri" w:cs="Calibri"/>
+                      <w:spacing w:val="-4"/>
+                      <w:sz w:val="20"/>
+                      <w:szCs w:val="20"/>
+                    </w:rPr>
+                  </w:pPr>
+                  <w:r>
+                    <w:rPr>
+                      <w:rFonts w:ascii="Calibri" w:hAnsi="Calibri" w:cs="Calibri"/>
+                      <w:spacing w:val="-4"/>
+                      <w:sz w:val="20"/>
+                      <w:szCs w:val="20"/>
+                    </w:rPr>
+                    <w:t xml:space="preserve">#1186, Kumaon Nagar, </w:t>
+                  </w:r>
+                  <w:proofErr w:type="spellStart"/>
+                  <w:r>
+                    <w:rPr>
+                      <w:rFonts w:ascii="Calibri" w:hAnsi="Calibri" w:cs="Calibri"/>
+                      <w:spacing w:val="-4"/>
+                      <w:sz w:val="20"/>
+                      <w:szCs w:val="20"/>
+                    </w:rPr>
+                    <w:t>Nayagaon</w:t>
+                  </w:r>
+                  <w:proofErr w:type="spellEnd"/>
+                  <w:r>
+                    <w:rPr>
+                      <w:rFonts w:ascii="Calibri" w:hAnsi="Calibri" w:cs="Calibri"/>
+                      <w:spacing w:val="-4"/>
+                      <w:sz w:val="20"/>
+                      <w:szCs w:val="20"/>
+                    </w:rPr>
+                    <w:t>, S.A.S Nagar Mohali, Punjab 160103</w:t>
+                  </w:r>
+                </w:p>
+              </w:tc>
+            </w:tr>
+          </w:tbl>
           <w:p>
             <w:pPr>
               <w:pStyle w:val="BodyText"/>
-              <w:spacing w:before="120" w:line="312" w:lineRule="auto"/>
+              <w:spacing w:line="312" w:lineRule="auto"/>
               <w:ind w:left="29"/>
               <w:rPr>
                 <w:rFonts w:ascii="Calibri" w:hAnsi="Calibri" w:cs="Calibri"/>
-                <w:spacing w:val="-4"/>
-                <w:sz w:val="20"/>
-                <w:szCs w:val="20"/>
-              </w:rPr>
-            </w:pPr>
-            <w:r>
-              <w:rPr>
-                <w:rFonts w:ascii="Calibri" w:hAnsi="Calibri" w:cs="Calibri"/>
-                <w:spacing w:val="-4"/>
-                <w:sz w:val="20"/>
-                <w:szCs w:val="20"/>
-              </w:rPr>
-              <w:t>#1186, Block -D, Kumaon Nagar, Nayagaon, S.A.S. Nagar Mohali -160103</w:t>
-            </w:r>
-            <w:r>
-              <w:rPr>
-                <w:rFonts w:ascii="Calibri" w:hAnsi="Calibri" w:cs="Calibri"/>
-                <w:spacing w:val="-4"/>
-                <w:sz w:val="20"/>
-                <w:szCs w:val="20"/>
-              </w:rPr>
-              <w:br/>
-            </w:r>
+                <w:spacing w:val="-2"/>
+              </w:rPr>
+            </w:pPr>
           </w:p>
           <w:p>
             <w:pPr>
@@ -3806,15 +4047,21 @@
               <w:rPr>
                 <w:rFonts w:ascii="Calibri" w:hAnsi="Calibri" w:cs="Calibri"/>
                 <w:bCs/>
-              </w:rPr>
-            </w:pPr>
+                <w:sz w:val="20"/>
+                <w:szCs w:val="20"/>
+              </w:rPr>
+            </w:pPr>
+            <w:proofErr w:type="gramStart"/>
             <w:r>
               <w:rPr>
                 <w:rFonts w:ascii="Calibri" w:hAnsi="Calibri" w:cs="Calibri"/>
                 <w:bCs/>
+                <w:sz w:val="20"/>
+                <w:szCs w:val="20"/>
               </w:rPr>
               <w:t>Date :</w:t>
             </w:r>
+            <w:proofErr w:type="gramEnd"/>
           </w:p>
           <w:p>
             <w:pPr>
@@ -3823,14 +4070,29 @@
               <w:rPr>
                 <w:rFonts w:ascii="Calibri" w:hAnsi="Calibri" w:cs="Calibri"/>
                 <w:bCs/>
-              </w:rPr>
-            </w:pPr>
+                <w:sz w:val="20"/>
+                <w:szCs w:val="20"/>
+              </w:rPr>
+            </w:pPr>
+            <w:proofErr w:type="gramStart"/>
             <w:r>
               <w:rPr>
                 <w:rFonts w:ascii="Calibri" w:hAnsi="Calibri" w:cs="Calibri"/>
                 <w:bCs/>
-              </w:rPr>
-              <w:t>Place :                                                                                               (Signature)</w:t>
+                <w:sz w:val="20"/>
+                <w:szCs w:val="20"/>
+              </w:rPr>
+              <w:t>Place :</w:t>
+            </w:r>
+            <w:proofErr w:type="gramEnd"/>
+            <w:r>
+              <w:rPr>
+                <w:rFonts w:ascii="Calibri" w:hAnsi="Calibri" w:cs="Calibri"/>
+                <w:bCs/>
+                <w:sz w:val="20"/>
+                <w:szCs w:val="20"/>
+              </w:rPr>
+              <w:t xml:space="preserve">                                                                                               (Signature)</w:t>
             </w:r>
           </w:p>
           <w:p>

</xml_diff>

<commit_message>
Gender added and Alignment fixed
</commit_message>
<xml_diff>
--- a/Tarun-Kumar-Software-Developer-CV.docx
+++ b/Tarun-Kumar-Software-Developer-CV.docx
@@ -2325,12 +2325,29 @@
               <w:rPr>
                 <w:rFonts w:ascii="Calibri" w:hAnsi="Calibri" w:cs="Calibri"/>
                 <w:bCs/>
+                <w:i/>
+                <w:iCs/>
                 <w:spacing w:val="-4"/>
                 <w:sz w:val="20"/>
                 <w:szCs w:val="20"/>
               </w:rPr>
             </w:pPr>
             <w:r>
+              <w:rPr>
+                <w:rFonts w:ascii="Calibri" w:hAnsi="Calibri" w:cs="Calibri"/>
+                <w:bCs/>
+                <w:i/>
+                <w:iCs/>
+                <w:spacing w:val="-4"/>
+                <w:sz w:val="20"/>
+                <w:szCs w:val="20"/>
+              </w:rPr>
+              <w:t>Kurukshetra University</w:t>
+            </w:r>
+          </w:p>
+          <w:p>
+            <w:pPr>
+              <w:ind w:left="29"/>
               <w:rPr>
                 <w:rFonts w:ascii="Calibri" w:hAnsi="Calibri" w:cs="Calibri"/>
                 <w:bCs/>
@@ -2338,12 +2355,8 @@
                 <w:sz w:val="20"/>
                 <w:szCs w:val="20"/>
               </w:rPr>
-              <w:t>Kurukshetra University</w:t>
-            </w:r>
-          </w:p>
-          <w:p>
-            <w:pPr>
-              <w:ind w:left="29"/>
+            </w:pPr>
+            <w:r>
               <w:rPr>
                 <w:rFonts w:ascii="Calibri" w:hAnsi="Calibri" w:cs="Calibri"/>
                 <w:bCs/>
@@ -2351,6 +2364,18 @@
                 <w:sz w:val="20"/>
                 <w:szCs w:val="20"/>
               </w:rPr>
+              <w:t>06/2006 – 05/2009</w:t>
+            </w:r>
+          </w:p>
+          <w:p>
+            <w:pPr>
+              <w:ind w:left="29"/>
+              <w:rPr>
+                <w:rFonts w:ascii="Calibri" w:hAnsi="Calibri" w:cs="Calibri"/>
+                <w:bCs/>
+                <w:sz w:val="20"/>
+                <w:szCs w:val="20"/>
+              </w:rPr>
             </w:pPr>
             <w:r>
               <w:rPr>
@@ -2360,27 +2385,6 @@
                 <w:sz w:val="20"/>
                 <w:szCs w:val="20"/>
               </w:rPr>
-              <w:t>06/2006 – 05/2009</w:t>
-            </w:r>
-          </w:p>
-          <w:p>
-            <w:pPr>
-              <w:ind w:left="29"/>
-              <w:rPr>
-                <w:rFonts w:ascii="Calibri" w:hAnsi="Calibri" w:cs="Calibri"/>
-                <w:bCs/>
-                <w:sz w:val="20"/>
-                <w:szCs w:val="20"/>
-              </w:rPr>
-            </w:pPr>
-            <w:r>
-              <w:rPr>
-                <w:rFonts w:ascii="Calibri" w:hAnsi="Calibri" w:cs="Calibri"/>
-                <w:bCs/>
-                <w:spacing w:val="-4"/>
-                <w:sz w:val="20"/>
-                <w:szCs w:val="20"/>
-              </w:rPr>
               <w:t xml:space="preserve"> </w:t>
             </w:r>
           </w:p>
@@ -2410,6 +2414,8 @@
               <w:rPr>
                 <w:rFonts w:ascii="Calibri" w:hAnsi="Calibri" w:cs="Calibri"/>
                 <w:bCs/>
+                <w:i/>
+                <w:iCs/>
                 <w:spacing w:val="-4"/>
                 <w:sz w:val="20"/>
                 <w:szCs w:val="20"/>
@@ -2419,6 +2425,8 @@
               <w:rPr>
                 <w:rFonts w:ascii="Calibri" w:hAnsi="Calibri" w:cs="Calibri"/>
                 <w:bCs/>
+                <w:i/>
+                <w:iCs/>
                 <w:spacing w:val="-4"/>
                 <w:sz w:val="20"/>
                 <w:szCs w:val="20"/>
@@ -3756,6 +3764,60 @@
                       <w:szCs w:val="20"/>
                     </w:rPr>
                     <w:t>Sh. Om Parkash</w:t>
+                  </w:r>
+                </w:p>
+              </w:tc>
+            </w:tr>
+            <w:tr>
+              <w:tc>
+                <w:tcPr>
+                  <w:tcW w:w="3016" w:type="dxa"/>
+                </w:tcPr>
+                <w:p>
+                  <w:pPr>
+                    <w:pStyle w:val="BodyText"/>
+                    <w:spacing w:line="312" w:lineRule="auto"/>
+                    <w:rPr>
+                      <w:rFonts w:ascii="Calibri" w:hAnsi="Calibri" w:cs="Calibri"/>
+                      <w:spacing w:val="-4"/>
+                      <w:sz w:val="20"/>
+                      <w:szCs w:val="20"/>
+                    </w:rPr>
+                  </w:pPr>
+                  <w:r>
+                    <w:rPr>
+                      <w:rFonts w:ascii="Calibri" w:hAnsi="Calibri" w:cs="Calibri"/>
+                      <w:spacing w:val="-4"/>
+                      <w:sz w:val="20"/>
+                      <w:szCs w:val="20"/>
+                    </w:rPr>
+                    <w:t>Gender:</w:t>
+                  </w:r>
+                </w:p>
+              </w:tc>
+              <w:tc>
+                <w:tcPr>
+                  <w:tcW w:w="3240" w:type="dxa"/>
+                </w:tcPr>
+                <w:p>
+                  <w:pPr>
+                    <w:pStyle w:val="BodyText"/>
+                    <w:spacing w:line="312" w:lineRule="auto"/>
+                    <w:rPr>
+                      <w:rFonts w:ascii="Calibri" w:hAnsi="Calibri" w:cs="Calibri"/>
+                      <w:spacing w:val="-4"/>
+                      <w:sz w:val="20"/>
+                      <w:szCs w:val="20"/>
+                    </w:rPr>
+                  </w:pPr>
+                  <w:r>
+                    <w:rPr>
+                      <w:rFonts w:ascii="Calibri" w:hAnsi="Calibri" w:cs="Calibri"/>
+                      <w:spacing w:val="-4"/>
+                      <w:sz w:val="20"/>
+                      <w:szCs w:val="20"/>
+                    </w:rPr>
+                    <w:t>Male</w:t>
                   </w:r>
                 </w:p>
               </w:tc>

</xml_diff>

<commit_message>
Interview Question file added and Resume updated
</commit_message>
<xml_diff>
--- a/Tarun-Kumar-Software-Developer-CV.docx
+++ b/Tarun-Kumar-Software-Developer-CV.docx
@@ -34,7 +34,7 @@
                 <w:rFonts w:ascii="Calibri" w:hAnsi="Calibri" w:cs="Calibri"/>
                 <w:b/>
                 <w:bCs/>
-                <w:color w:val="FFFFFF" w:themeColor="background1"/>
+                <w:color w:val="000000" w:themeColor="text1"/>
                 <w:sz w:val="24"/>
                 <w:szCs w:val="24"/>
               </w:rPr>
@@ -45,14 +45,14 @@
                 <w:b/>
                 <w:bCs/>
                 <w:noProof/>
-                <w:color w:val="FFFFFF" w:themeColor="background1"/>
+                <w:color w:val="000000" w:themeColor="text1"/>
                 <w:sz w:val="24"/>
                 <w:szCs w:val="24"/>
               </w:rPr>
               <mc:AlternateContent>
                 <mc:Choice Requires="wps">
                   <w:drawing>
-                    <wp:anchor distT="0" distB="0" distL="0" distR="0" simplePos="0" relativeHeight="251676672" behindDoc="1" locked="0" layoutInCell="1" allowOverlap="1" wp14:anchorId="47C5C8CE" wp14:editId="37AE5180">
+                    <wp:anchor distT="0" distB="0" distL="0" distR="0" simplePos="0" relativeHeight="251676672" behindDoc="1" locked="0" layoutInCell="1" allowOverlap="1" wp14:anchorId="47C5C8CE" wp14:editId="61D7D355">
                       <wp:simplePos x="0" y="0"/>
                       <wp:positionH relativeFrom="page">
                         <wp:posOffset>-223520</wp:posOffset>
@@ -107,7 +107,7 @@
                               </a:custGeom>
                               <a:solidFill>
                                 <a:schemeClr val="bg1">
-                                  <a:lumMod val="50000"/>
+                                  <a:lumMod val="85000"/>
                                 </a:schemeClr>
                               </a:solidFill>
                             </wps:spPr>
@@ -128,7 +128,7 @@
                 </mc:Choice>
                 <mc:Fallback>
                   <w:pict>
-                    <v:shape w14:anchorId="669EAF17" id="Graphic 1" o:spid="_x0000_s1026" style="position:absolute;margin-left:-17.6pt;margin-top:-26.3pt;width:249pt;height:841.95pt;z-index:-251639808;visibility:visible;mso-wrap-style:square;mso-width-percent:0;mso-wrap-distance-left:0;mso-wrap-distance-top:0;mso-wrap-distance-right:0;mso-wrap-distance-bottom:0;mso-position-horizontal:absolute;mso-position-horizontal-relative:page;mso-position-vertical:absolute;mso-position-vertical-relative:page;mso-width-percent:0;mso-width-relative:margin;v-text-anchor:top" coordsize="3019425,10692765" o:gfxdata="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" path="m,10692383l,,3019424,r,10692383l,10692383xe" fillcolor="#7f7f7f [1612]" stroked="f">
+                    <v:shape w14:anchorId="7C79463A" id="Graphic 1" o:spid="_x0000_s1026" style="position:absolute;margin-left:-17.6pt;margin-top:-26.3pt;width:249pt;height:841.95pt;z-index:-251639808;visibility:visible;mso-wrap-style:square;mso-width-percent:0;mso-wrap-distance-left:0;mso-wrap-distance-top:0;mso-wrap-distance-right:0;mso-wrap-distance-bottom:0;mso-position-horizontal:absolute;mso-position-horizontal-relative:page;mso-position-vertical:absolute;mso-position-vertical-relative:page;mso-width-percent:0;mso-width-relative:margin;v-text-anchor:top" coordsize="3019425,10692765" o:gfxdata="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" path="m,10692383l,,3019424,r,10692383l,10692383xe" fillcolor="#d8d8d8 [2732]" stroked="f">
                       <v:path arrowok="t"/>
                       <w10:wrap anchorx="page" anchory="page"/>
                     </v:shape>
@@ -141,7 +141,7 @@
                 <w:rFonts w:ascii="Calibri" w:hAnsi="Calibri" w:cs="Calibri"/>
                 <w:b/>
                 <w:bCs/>
-                <w:color w:val="FFFFFF" w:themeColor="background1"/>
+                <w:color w:val="000000" w:themeColor="text1"/>
                 <w:sz w:val="24"/>
                 <w:szCs w:val="24"/>
               </w:rPr>
@@ -178,7 +178,7 @@
               <mc:AlternateContent>
                 <mc:Choice Requires="wpg">
                   <w:drawing>
-                    <wp:inline distT="0" distB="0" distL="0" distR="0" wp14:anchorId="3AC6EE15" wp14:editId="7CA87B4F">
+                    <wp:inline distT="0" distB="0" distL="0" distR="0" wp14:anchorId="3AC6EE15" wp14:editId="29515FFC">
                       <wp:extent cx="1857375" cy="19050"/>
                       <wp:effectExtent l="0" t="0" r="0" b="0"/>
                       <wp:docPr id="2" name="Group 2"/>
@@ -198,6 +198,9 @@
                                 <a:chOff x="0" y="0"/>
                                 <a:chExt cx="1857375" cy="19050"/>
                               </a:xfrm>
+                              <a:solidFill>
+                                <a:schemeClr val="tx1"/>
+                              </a:solidFill>
                             </wpg:grpSpPr>
                             <wps:wsp>
                               <wps:cNvPr id="3" name="Graphic 3"/>
@@ -234,9 +237,7 @@
                                     </a:path>
                                   </a:pathLst>
                                 </a:custGeom>
-                                <a:solidFill>
-                                  <a:srgbClr val="F6F7F1"/>
-                                </a:solidFill>
+                                <a:grpFill/>
                               </wps:spPr>
                               <wps:bodyPr wrap="square" lIns="0" tIns="0" rIns="0" bIns="0" rtlCol="0">
                                 <a:prstTxWarp prst="textNoShape">
@@ -253,8 +254,8 @@
                 </mc:Choice>
                 <mc:Fallback>
                   <w:pict>
-                    <v:group w14:anchorId="7EE1748C" id="Group 2" o:spid="_x0000_s1026" style="width:146.25pt;height:1.5pt;mso-position-horizontal-relative:char;mso-position-vertical-relative:line" coordsize="18573,190" o:gfxdata="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">
-                      <v:shape id="Graphic 3" o:spid="_x0000_s1027" style="position:absolute;width:18573;height:190;visibility:visible;mso-wrap-style:square;v-text-anchor:top" coordsize="1857375,19050" o:gfxdata="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" path="m1857374,19049l,19049,,,1857374,r,19049xe" fillcolor="#f6f7f1" stroked="f">
+                    <v:group w14:anchorId="6FA407B1" id="Group 2" o:spid="_x0000_s1026" style="width:146.25pt;height:1.5pt;mso-position-horizontal-relative:char;mso-position-vertical-relative:line" coordsize="18573,190" o:gfxdata="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">
+                      <v:shape id="Graphic 3" o:spid="_x0000_s1027" style="position:absolute;width:18573;height:190;visibility:visible;mso-wrap-style:square;v-text-anchor:top" coordsize="1857375,19050" o:gfxdata="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" path="m1857374,19049l,19049,,,1857374,r,19049xe" filled="f" stroked="f">
                         <v:path arrowok="t"/>
                       </v:shape>
                       <w10:anchorlock/>
@@ -271,14 +272,15 @@
               <w:ind w:left="28"/>
               <w:rPr>
                 <w:rFonts w:ascii="Calibri" w:hAnsi="Calibri" w:cs="Calibri"/>
-                <w:sz w:val="20"/>
-                <w:szCs w:val="20"/>
-              </w:rPr>
-            </w:pPr>
-            <w:r>
-              <w:rPr>
-                <w:rFonts w:ascii="Calibri" w:hAnsi="Calibri" w:cs="Calibri"/>
-                <w:color w:val="F6F7F1"/>
+                <w:color w:val="000000" w:themeColor="text1"/>
+                <w:sz w:val="20"/>
+                <w:szCs w:val="20"/>
+              </w:rPr>
+            </w:pPr>
+            <w:r>
+              <w:rPr>
+                <w:rFonts w:ascii="Calibri" w:hAnsi="Calibri" w:cs="Calibri"/>
+                <w:color w:val="000000" w:themeColor="text1"/>
                 <w:spacing w:val="-6"/>
                 <w:sz w:val="20"/>
                 <w:szCs w:val="20"/>
@@ -288,7 +290,7 @@
             <w:r>
               <w:rPr>
                 <w:rFonts w:ascii="Calibri" w:hAnsi="Calibri" w:cs="Calibri"/>
-                <w:color w:val="F6F7F1"/>
+                <w:color w:val="000000" w:themeColor="text1"/>
                 <w:spacing w:val="-11"/>
                 <w:sz w:val="20"/>
                 <w:szCs w:val="20"/>
@@ -298,7 +300,7 @@
             <w:r>
               <w:rPr>
                 <w:rFonts w:ascii="Calibri" w:hAnsi="Calibri" w:cs="Calibri"/>
-                <w:color w:val="F6F7F1"/>
+                <w:color w:val="000000" w:themeColor="text1"/>
                 <w:spacing w:val="-6"/>
                 <w:sz w:val="20"/>
                 <w:szCs w:val="20"/>
@@ -308,7 +310,7 @@
             <w:r>
               <w:rPr>
                 <w:rFonts w:ascii="Calibri" w:hAnsi="Calibri" w:cs="Calibri"/>
-                <w:color w:val="F6F7F1"/>
+                <w:color w:val="000000" w:themeColor="text1"/>
                 <w:spacing w:val="-11"/>
                 <w:sz w:val="20"/>
                 <w:szCs w:val="20"/>
@@ -318,7 +320,7 @@
             <w:r>
               <w:rPr>
                 <w:rFonts w:ascii="Calibri" w:hAnsi="Calibri" w:cs="Calibri"/>
-                <w:color w:val="F6F7F1"/>
+                <w:color w:val="000000" w:themeColor="text1"/>
                 <w:spacing w:val="-6"/>
                 <w:sz w:val="20"/>
                 <w:szCs w:val="20"/>
@@ -328,7 +330,7 @@
             <w:r>
               <w:rPr>
                 <w:rFonts w:ascii="Calibri" w:hAnsi="Calibri" w:cs="Calibri"/>
-                <w:color w:val="F6F7F1"/>
+                <w:color w:val="000000" w:themeColor="text1"/>
                 <w:spacing w:val="-11"/>
                 <w:sz w:val="20"/>
                 <w:szCs w:val="20"/>
@@ -338,7 +340,7 @@
             <w:r>
               <w:rPr>
                 <w:rFonts w:ascii="Calibri" w:hAnsi="Calibri" w:cs="Calibri"/>
-                <w:color w:val="F6F7F1"/>
+                <w:color w:val="000000" w:themeColor="text1"/>
                 <w:spacing w:val="-6"/>
                 <w:sz w:val="20"/>
                 <w:szCs w:val="20"/>
@@ -348,7 +350,7 @@
             <w:r>
               <w:rPr>
                 <w:rFonts w:ascii="Calibri" w:hAnsi="Calibri" w:cs="Calibri"/>
-                <w:color w:val="F6F7F1"/>
+                <w:color w:val="000000" w:themeColor="text1"/>
                 <w:spacing w:val="-11"/>
                 <w:sz w:val="20"/>
                 <w:szCs w:val="20"/>
@@ -358,7 +360,7 @@
             <w:r>
               <w:rPr>
                 <w:rFonts w:ascii="Calibri" w:hAnsi="Calibri" w:cs="Calibri"/>
-                <w:color w:val="F6F7F1"/>
+                <w:color w:val="000000" w:themeColor="text1"/>
                 <w:spacing w:val="-6"/>
                 <w:sz w:val="20"/>
                 <w:szCs w:val="20"/>
@@ -368,7 +370,7 @@
             <w:r>
               <w:rPr>
                 <w:rFonts w:ascii="Calibri" w:hAnsi="Calibri" w:cs="Calibri"/>
-                <w:color w:val="F6F7F1"/>
+                <w:color w:val="000000" w:themeColor="text1"/>
                 <w:spacing w:val="-11"/>
                 <w:sz w:val="20"/>
                 <w:szCs w:val="20"/>
@@ -378,7 +380,7 @@
             <w:r>
               <w:rPr>
                 <w:rFonts w:ascii="Calibri" w:hAnsi="Calibri" w:cs="Calibri"/>
-                <w:color w:val="F6F7F1"/>
+                <w:color w:val="000000" w:themeColor="text1"/>
                 <w:spacing w:val="-6"/>
                 <w:sz w:val="20"/>
                 <w:szCs w:val="20"/>
@@ -388,7 +390,7 @@
             <w:r>
               <w:rPr>
                 <w:rFonts w:ascii="Calibri" w:hAnsi="Calibri" w:cs="Calibri"/>
-                <w:color w:val="F6F7F1"/>
+                <w:color w:val="000000" w:themeColor="text1"/>
                 <w:sz w:val="20"/>
                 <w:szCs w:val="20"/>
               </w:rPr>
@@ -397,7 +399,7 @@
             <w:r>
               <w:rPr>
                 <w:rFonts w:ascii="Calibri" w:hAnsi="Calibri" w:cs="Calibri"/>
-                <w:color w:val="F6F7F1"/>
+                <w:color w:val="000000" w:themeColor="text1"/>
                 <w:spacing w:val="-2"/>
                 <w:sz w:val="20"/>
                 <w:szCs w:val="20"/>
@@ -407,7 +409,7 @@
             <w:r>
               <w:rPr>
                 <w:rFonts w:ascii="Calibri" w:hAnsi="Calibri" w:cs="Calibri"/>
-                <w:color w:val="F6F7F1"/>
+                <w:color w:val="000000" w:themeColor="text1"/>
                 <w:sz w:val="20"/>
                 <w:szCs w:val="20"/>
               </w:rPr>
@@ -416,7 +418,7 @@
             <w:r>
               <w:rPr>
                 <w:rFonts w:ascii="Calibri" w:hAnsi="Calibri" w:cs="Calibri"/>
-                <w:color w:val="F6F7F1"/>
+                <w:color w:val="000000" w:themeColor="text1"/>
                 <w:spacing w:val="-2"/>
                 <w:sz w:val="20"/>
                 <w:szCs w:val="20"/>
@@ -426,7 +428,7 @@
             <w:r>
               <w:rPr>
                 <w:rFonts w:ascii="Calibri" w:hAnsi="Calibri" w:cs="Calibri"/>
-                <w:color w:val="F6F7F1"/>
+                <w:color w:val="000000" w:themeColor="text1"/>
                 <w:sz w:val="20"/>
                 <w:szCs w:val="20"/>
               </w:rPr>
@@ -435,7 +437,7 @@
             <w:r>
               <w:rPr>
                 <w:rFonts w:ascii="Calibri" w:hAnsi="Calibri" w:cs="Calibri"/>
-                <w:color w:val="F6F7F1"/>
+                <w:color w:val="000000" w:themeColor="text1"/>
                 <w:spacing w:val="-2"/>
                 <w:sz w:val="20"/>
                 <w:szCs w:val="20"/>
@@ -445,7 +447,7 @@
             <w:r>
               <w:rPr>
                 <w:rFonts w:ascii="Calibri" w:hAnsi="Calibri" w:cs="Calibri"/>
-                <w:color w:val="F6F7F1"/>
+                <w:color w:val="000000" w:themeColor="text1"/>
                 <w:sz w:val="20"/>
                 <w:szCs w:val="20"/>
               </w:rPr>
@@ -456,15 +458,15 @@
             <w:pPr>
               <w:rPr>
                 <w:rFonts w:ascii="Calibri" w:hAnsi="Calibri" w:cs="Calibri"/>
-                <w:color w:val="F6F7F1"/>
-                <w:sz w:val="20"/>
-                <w:szCs w:val="20"/>
-              </w:rPr>
-            </w:pPr>
-            <w:r>
-              <w:rPr>
-                <w:rFonts w:ascii="Calibri" w:hAnsi="Calibri" w:cs="Calibri"/>
-                <w:color w:val="F6F7F1"/>
+                <w:color w:val="000000" w:themeColor="text1"/>
+                <w:sz w:val="20"/>
+                <w:szCs w:val="20"/>
+              </w:rPr>
+            </w:pPr>
+            <w:r>
+              <w:rPr>
+                <w:rFonts w:ascii="Calibri" w:hAnsi="Calibri" w:cs="Calibri"/>
+                <w:color w:val="000000" w:themeColor="text1"/>
                 <w:spacing w:val="-2"/>
                 <w:sz w:val="20"/>
                 <w:szCs w:val="20"/>
@@ -474,7 +476,7 @@
             <w:r>
               <w:rPr>
                 <w:rFonts w:ascii="Calibri" w:hAnsi="Calibri" w:cs="Calibri"/>
-                <w:color w:val="F6F7F1"/>
+                <w:color w:val="000000" w:themeColor="text1"/>
                 <w:spacing w:val="-12"/>
                 <w:sz w:val="20"/>
                 <w:szCs w:val="20"/>
@@ -484,7 +486,7 @@
             <w:r>
               <w:rPr>
                 <w:rFonts w:ascii="Calibri" w:hAnsi="Calibri" w:cs="Calibri"/>
-                <w:color w:val="F6F7F1"/>
+                <w:color w:val="000000" w:themeColor="text1"/>
                 <w:spacing w:val="-2"/>
                 <w:sz w:val="20"/>
                 <w:szCs w:val="20"/>
@@ -494,7 +496,7 @@
             <w:r>
               <w:rPr>
                 <w:rFonts w:ascii="Calibri" w:hAnsi="Calibri" w:cs="Calibri"/>
-                <w:color w:val="F6F7F1"/>
+                <w:color w:val="000000" w:themeColor="text1"/>
                 <w:spacing w:val="-12"/>
                 <w:sz w:val="20"/>
                 <w:szCs w:val="20"/>
@@ -504,57 +506,37 @@
             <w:r>
               <w:rPr>
                 <w:rFonts w:ascii="Calibri" w:hAnsi="Calibri" w:cs="Calibri"/>
-                <w:color w:val="F6F7F1"/>
+                <w:color w:val="000000" w:themeColor="text1"/>
                 <w:spacing w:val="-2"/>
                 <w:sz w:val="20"/>
                 <w:szCs w:val="20"/>
               </w:rPr>
-              <w:t>C</w:t>
-            </w:r>
-            <w:r>
-              <w:rPr>
-                <w:rFonts w:ascii="Calibri" w:hAnsi="Calibri" w:cs="Calibri"/>
-                <w:color w:val="F6F7F1"/>
+              <w:t>Client</w:t>
+            </w:r>
+            <w:r>
+              <w:rPr>
+                <w:rFonts w:ascii="Calibri" w:hAnsi="Calibri" w:cs="Calibri"/>
+                <w:color w:val="000000" w:themeColor="text1"/>
+                <w:spacing w:val="-12"/>
+                <w:sz w:val="20"/>
+                <w:szCs w:val="20"/>
+              </w:rPr>
+              <w:t xml:space="preserve"> </w:t>
+            </w:r>
+            <w:r>
+              <w:rPr>
+                <w:rFonts w:ascii="Calibri" w:hAnsi="Calibri" w:cs="Calibri"/>
+                <w:color w:val="000000" w:themeColor="text1"/>
                 <w:spacing w:val="-2"/>
                 <w:sz w:val="20"/>
                 <w:szCs w:val="20"/>
               </w:rPr>
-              <w:t>lient</w:t>
-            </w:r>
-            <w:r>
-              <w:rPr>
-                <w:rFonts w:ascii="Calibri" w:hAnsi="Calibri" w:cs="Calibri"/>
-                <w:color w:val="F6F7F1"/>
-                <w:spacing w:val="-12"/>
-                <w:sz w:val="20"/>
-                <w:szCs w:val="20"/>
-              </w:rPr>
-              <w:t xml:space="preserve"> </w:t>
-            </w:r>
-            <w:r>
-              <w:rPr>
-                <w:rFonts w:ascii="Calibri" w:hAnsi="Calibri" w:cs="Calibri"/>
-                <w:color w:val="F6F7F1"/>
-                <w:spacing w:val="-2"/>
-                <w:sz w:val="20"/>
-                <w:szCs w:val="20"/>
-              </w:rPr>
-              <w:t>L</w:t>
-            </w:r>
-            <w:r>
-              <w:rPr>
-                <w:rFonts w:ascii="Calibri" w:hAnsi="Calibri" w:cs="Calibri"/>
-                <w:color w:val="F6F7F1"/>
-                <w:spacing w:val="-2"/>
-                <w:sz w:val="20"/>
-                <w:szCs w:val="20"/>
-              </w:rPr>
-              <w:t xml:space="preserve">anguage </w:t>
-            </w:r>
-            <w:r>
-              <w:rPr>
-                <w:rFonts w:ascii="Calibri" w:hAnsi="Calibri" w:cs="Calibri"/>
-                <w:color w:val="F6F7F1"/>
+              <w:t xml:space="preserve">Language </w:t>
+            </w:r>
+            <w:r>
+              <w:rPr>
+                <w:rFonts w:ascii="Calibri" w:hAnsi="Calibri" w:cs="Calibri"/>
+                <w:color w:val="000000" w:themeColor="text1"/>
                 <w:sz w:val="20"/>
                 <w:szCs w:val="20"/>
               </w:rPr>
@@ -565,7 +547,7 @@
             <w:pPr>
               <w:rPr>
                 <w:rFonts w:ascii="Calibri" w:hAnsi="Calibri" w:cs="Calibri"/>
-                <w:color w:val="F6F7F1"/>
+                <w:color w:val="000000" w:themeColor="text1"/>
                 <w:sz w:val="20"/>
                 <w:szCs w:val="20"/>
               </w:rPr>
@@ -578,6 +560,7 @@
                 <w:rFonts w:ascii="Calibri" w:hAnsi="Calibri" w:cs="Calibri"/>
                 <w:b/>
                 <w:bCs/>
+                <w:color w:val="000000" w:themeColor="text1"/>
                 <w:sz w:val="24"/>
                 <w:szCs w:val="24"/>
               </w:rPr>
@@ -587,7 +570,7 @@
                 <w:rFonts w:ascii="Calibri" w:hAnsi="Calibri" w:cs="Calibri"/>
                 <w:b/>
                 <w:bCs/>
-                <w:color w:val="F6F7F1"/>
+                <w:color w:val="000000" w:themeColor="text1"/>
                 <w:spacing w:val="2"/>
                 <w:sz w:val="24"/>
                 <w:szCs w:val="24"/>
@@ -599,7 +582,7 @@
                 <w:rFonts w:ascii="Calibri" w:hAnsi="Calibri" w:cs="Calibri"/>
                 <w:b/>
                 <w:bCs/>
-                <w:color w:val="F6F7F1"/>
+                <w:color w:val="000000" w:themeColor="text1"/>
                 <w:spacing w:val="45"/>
                 <w:sz w:val="24"/>
                 <w:szCs w:val="24"/>
@@ -611,7 +594,7 @@
                 <w:rFonts w:ascii="Calibri" w:hAnsi="Calibri" w:cs="Calibri"/>
                 <w:b/>
                 <w:bCs/>
-                <w:color w:val="F6F7F1"/>
+                <w:color w:val="000000" w:themeColor="text1"/>
                 <w:spacing w:val="-2"/>
                 <w:sz w:val="24"/>
                 <w:szCs w:val="24"/>
@@ -626,6 +609,7 @@
               <w:rPr>
                 <w:rFonts w:ascii="Calibri" w:hAnsi="Calibri" w:cs="Calibri"/>
                 <w:b/>
+                <w:color w:val="000000" w:themeColor="text1"/>
                 <w:sz w:val="3"/>
               </w:rPr>
             </w:pPr>
@@ -637,6 +621,7 @@
               <w:ind w:left="28" w:right="-72"/>
               <w:rPr>
                 <w:rFonts w:ascii="Calibri" w:hAnsi="Calibri" w:cs="Calibri"/>
+                <w:color w:val="000000" w:themeColor="text1"/>
                 <w:sz w:val="2"/>
               </w:rPr>
             </w:pPr>
@@ -644,12 +629,13 @@
               <w:rPr>
                 <w:rFonts w:ascii="Calibri" w:hAnsi="Calibri" w:cs="Calibri"/>
                 <w:noProof/>
+                <w:color w:val="000000" w:themeColor="text1"/>
                 <w:sz w:val="2"/>
               </w:rPr>
               <mc:AlternateContent>
                 <mc:Choice Requires="wpg">
                   <w:drawing>
-                    <wp:inline distT="0" distB="0" distL="0" distR="0" wp14:anchorId="4D281A06" wp14:editId="167B328C">
+                    <wp:inline distT="0" distB="0" distL="0" distR="0" wp14:anchorId="4D281A06" wp14:editId="31DC2170">
                       <wp:extent cx="1857375" cy="19050"/>
                       <wp:effectExtent l="0" t="0" r="0" b="0"/>
                       <wp:docPr id="4" name="Group 4"/>
@@ -669,6 +655,9 @@
                                 <a:chOff x="0" y="0"/>
                                 <a:chExt cx="1857375" cy="19050"/>
                               </a:xfrm>
+                              <a:solidFill>
+                                <a:schemeClr val="tx1"/>
+                              </a:solidFill>
                             </wpg:grpSpPr>
                             <wps:wsp>
                               <wps:cNvPr id="5" name="Graphic 5"/>
@@ -705,9 +694,7 @@
                                     </a:path>
                                   </a:pathLst>
                                 </a:custGeom>
-                                <a:solidFill>
-                                  <a:srgbClr val="F6F7F1"/>
-                                </a:solidFill>
+                                <a:grpFill/>
                               </wps:spPr>
                               <wps:bodyPr wrap="square" lIns="0" tIns="0" rIns="0" bIns="0" rtlCol="0">
                                 <a:prstTxWarp prst="textNoShape">
@@ -724,8 +711,8 @@
                 </mc:Choice>
                 <mc:Fallback>
                   <w:pict>
-                    <v:group w14:anchorId="33D241C6" id="Group 4" o:spid="_x0000_s1026" style="width:146.25pt;height:1.5pt;mso-position-horizontal-relative:char;mso-position-vertical-relative:line" coordsize="18573,190" o:gfxdata="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">
-                      <v:shape id="Graphic 5" o:spid="_x0000_s1027" style="position:absolute;width:18573;height:190;visibility:visible;mso-wrap-style:square;v-text-anchor:top" coordsize="1857375,19050" o:gfxdata="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" path="m1857374,19049l,19049,,,1857374,r,19049xe" fillcolor="#f6f7f1" stroked="f">
+                    <v:group w14:anchorId="4C2087F4" id="Group 4" o:spid="_x0000_s1026" style="width:146.25pt;height:1.5pt;mso-position-horizontal-relative:char;mso-position-vertical-relative:line" coordsize="18573,190" o:gfxdata="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">
+                      <v:shape id="Graphic 5" o:spid="_x0000_s1027" style="position:absolute;width:18573;height:190;visibility:visible;mso-wrap-style:square;v-text-anchor:top" coordsize="1857375,19050" o:gfxdata="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" path="m1857374,19049l,19049,,,1857374,r,19049xe" filled="f" stroked="f">
                         <v:path arrowok="t"/>
                       </v:shape>
                       <w10:anchorlock/>
@@ -743,7 +730,7 @@
                 <w:rFonts w:ascii="Calibri" w:hAnsi="Calibri" w:cs="Calibri"/>
                 <w:i/>
                 <w:iCs/>
-                <w:color w:val="FFFFFF" w:themeColor="background1"/>
+                <w:color w:val="000000" w:themeColor="text1"/>
                 <w:sz w:val="20"/>
                 <w:szCs w:val="20"/>
               </w:rPr>
@@ -752,17 +739,9 @@
               <w:rPr>
                 <w:rFonts w:ascii="Calibri" w:hAnsi="Calibri" w:cs="Calibri"/>
                 <w:b/>
-                <w:color w:val="F6F7F1"/>
-              </w:rPr>
-              <w:t>SDE II</w:t>
-            </w:r>
-            <w:r>
-              <w:rPr>
-                <w:rFonts w:ascii="Calibri" w:hAnsi="Calibri" w:cs="Calibri"/>
-                <w:b/>
-                <w:color w:val="F6F7F1"/>
-              </w:rPr>
-              <w:t xml:space="preserve">, </w:t>
+                <w:color w:val="000000" w:themeColor="text1"/>
+              </w:rPr>
+              <w:t xml:space="preserve">SDE II, </w:t>
             </w:r>
             <w:r>
               <w:rPr>
@@ -770,11 +749,21 @@
                 <w:bCs/>
                 <w:i/>
                 <w:iCs/>
-                <w:color w:val="F6F7F1"/>
+                <w:color w:val="000000" w:themeColor="text1"/>
                 <w:sz w:val="20"/>
                 <w:szCs w:val="20"/>
               </w:rPr>
               <w:t>Softobiz Technologies</w:t>
+            </w:r>
+            <w:r>
+              <w:rPr>
+                <w:rFonts w:ascii="Calibri" w:hAnsi="Calibri" w:cs="Calibri"/>
+                <w:b/>
+                <w:color w:val="000000" w:themeColor="text1"/>
+                <w:sz w:val="20"/>
+                <w:szCs w:val="20"/>
+              </w:rPr>
+              <w:t xml:space="preserve"> </w:t>
             </w:r>
             <w:r>
               <w:rPr>
@@ -784,16 +773,6 @@
                 <w:sz w:val="20"/>
                 <w:szCs w:val="20"/>
               </w:rPr>
-              <w:t xml:space="preserve"> </w:t>
-            </w:r>
-            <w:r>
-              <w:rPr>
-                <w:rFonts w:ascii="Calibri" w:hAnsi="Calibri" w:cs="Calibri"/>
-                <w:b/>
-                <w:color w:val="F6F7F1"/>
-                <w:sz w:val="20"/>
-                <w:szCs w:val="20"/>
-              </w:rPr>
               <w:br/>
             </w:r>
             <w:r>
@@ -801,7 +780,7 @@
                 <w:rFonts w:ascii="Calibri" w:hAnsi="Calibri" w:cs="Calibri"/>
                 <w:i/>
                 <w:iCs/>
-                <w:color w:val="FFFFFF" w:themeColor="background1"/>
+                <w:color w:val="000000" w:themeColor="text1"/>
                 <w:sz w:val="20"/>
                 <w:szCs w:val="20"/>
               </w:rPr>
@@ -812,7 +791,7 @@
                 <w:rFonts w:ascii="Calibri" w:hAnsi="Calibri" w:cs="Calibri"/>
                 <w:i/>
                 <w:iCs/>
-                <w:color w:val="FFFFFF" w:themeColor="background1"/>
+                <w:color w:val="000000" w:themeColor="text1"/>
                 <w:sz w:val="20"/>
                 <w:szCs w:val="20"/>
               </w:rPr>
@@ -823,7 +802,7 @@
                 <w:rFonts w:ascii="Calibri" w:hAnsi="Calibri" w:cs="Calibri"/>
                 <w:i/>
                 <w:iCs/>
-                <w:color w:val="FFFFFF" w:themeColor="background1"/>
+                <w:color w:val="000000" w:themeColor="text1"/>
                 <w:sz w:val="20"/>
                 <w:szCs w:val="20"/>
               </w:rPr>
@@ -841,15 +820,15 @@
               <w:ind w:left="350" w:right="346"/>
               <w:rPr>
                 <w:rFonts w:ascii="Calibri" w:hAnsi="Calibri" w:cs="Calibri"/>
-                <w:color w:val="FFFFFF" w:themeColor="background1"/>
-                <w:sz w:val="20"/>
-                <w:szCs w:val="20"/>
-              </w:rPr>
-            </w:pPr>
-            <w:r>
-              <w:rPr>
-                <w:rFonts w:ascii="Calibri" w:hAnsi="Calibri" w:cs="Calibri"/>
-                <w:color w:val="FFFFFF" w:themeColor="background1"/>
+                <w:color w:val="000000" w:themeColor="text1"/>
+                <w:sz w:val="20"/>
+                <w:szCs w:val="20"/>
+              </w:rPr>
+            </w:pPr>
+            <w:r>
+              <w:rPr>
+                <w:rFonts w:ascii="Calibri" w:hAnsi="Calibri" w:cs="Calibri"/>
+                <w:color w:val="000000" w:themeColor="text1"/>
                 <w:sz w:val="20"/>
                 <w:szCs w:val="20"/>
               </w:rPr>
@@ -867,28 +846,19 @@
               <w:ind w:left="350" w:right="346"/>
               <w:rPr>
                 <w:rFonts w:ascii="Calibri" w:hAnsi="Calibri" w:cs="Calibri"/>
-                <w:color w:val="FFFFFF" w:themeColor="background1"/>
-                <w:sz w:val="20"/>
-                <w:szCs w:val="20"/>
-              </w:rPr>
-            </w:pPr>
-            <w:r>
-              <w:rPr>
-                <w:rFonts w:ascii="Calibri" w:hAnsi="Calibri" w:cs="Calibri"/>
-                <w:color w:val="FFFFFF" w:themeColor="background1"/>
-                <w:sz w:val="20"/>
-                <w:szCs w:val="20"/>
-              </w:rPr>
-              <w:t>Worked as part of software development teams in the design, development, and support of both new and existing software products and systems</w:t>
-            </w:r>
-            <w:r>
-              <w:rPr>
-                <w:rFonts w:ascii="Calibri" w:hAnsi="Calibri" w:cs="Calibri"/>
-                <w:color w:val="FFFFFF" w:themeColor="background1"/>
-                <w:sz w:val="20"/>
-                <w:szCs w:val="20"/>
-              </w:rPr>
-              <w:t>.</w:t>
+                <w:color w:val="000000" w:themeColor="text1"/>
+                <w:sz w:val="20"/>
+                <w:szCs w:val="20"/>
+              </w:rPr>
+            </w:pPr>
+            <w:r>
+              <w:rPr>
+                <w:rFonts w:ascii="Calibri" w:hAnsi="Calibri" w:cs="Calibri"/>
+                <w:color w:val="000000" w:themeColor="text1"/>
+                <w:sz w:val="20"/>
+                <w:szCs w:val="20"/>
+              </w:rPr>
+              <w:t>Worked as part of software development teams in the design, development, and support of both new and existing software products and systems.</w:t>
             </w:r>
           </w:p>
           <w:p>
@@ -902,15 +872,15 @@
               <w:ind w:left="350" w:right="346"/>
               <w:rPr>
                 <w:rFonts w:ascii="Calibri" w:hAnsi="Calibri" w:cs="Calibri"/>
-                <w:color w:val="FFFFFF" w:themeColor="background1"/>
-                <w:sz w:val="20"/>
-                <w:szCs w:val="20"/>
-              </w:rPr>
-            </w:pPr>
-            <w:r>
-              <w:rPr>
-                <w:rFonts w:ascii="Calibri" w:hAnsi="Calibri" w:cs="Calibri"/>
-                <w:color w:val="FFFFFF" w:themeColor="background1"/>
+                <w:color w:val="000000" w:themeColor="text1"/>
+                <w:sz w:val="20"/>
+                <w:szCs w:val="20"/>
+              </w:rPr>
+            </w:pPr>
+            <w:r>
+              <w:rPr>
+                <w:rFonts w:ascii="Calibri" w:hAnsi="Calibri" w:cs="Calibri"/>
+                <w:color w:val="000000" w:themeColor="text1"/>
                 <w:sz w:val="20"/>
                 <w:szCs w:val="20"/>
               </w:rPr>
@@ -928,19 +898,39 @@
               <w:ind w:left="350" w:right="346"/>
               <w:rPr>
                 <w:rFonts w:ascii="Calibri" w:hAnsi="Calibri" w:cs="Calibri"/>
-                <w:color w:val="FFFFFF" w:themeColor="background1"/>
-                <w:sz w:val="20"/>
-                <w:szCs w:val="20"/>
-              </w:rPr>
-            </w:pPr>
-            <w:r>
-              <w:rPr>
-                <w:rFonts w:ascii="Calibri" w:hAnsi="Calibri" w:cs="Calibri"/>
-                <w:color w:val="FFFFFF" w:themeColor="background1"/>
-                <w:sz w:val="20"/>
-                <w:szCs w:val="20"/>
-              </w:rPr>
-              <w:t>Worked in Agile based environment with daily scrum calls and coordination with team members.</w:t>
+                <w:color w:val="000000" w:themeColor="text1"/>
+                <w:sz w:val="20"/>
+                <w:szCs w:val="20"/>
+              </w:rPr>
+            </w:pPr>
+            <w:r>
+              <w:rPr>
+                <w:rFonts w:ascii="Calibri" w:hAnsi="Calibri" w:cs="Calibri"/>
+                <w:color w:val="000000" w:themeColor="text1"/>
+                <w:sz w:val="20"/>
+                <w:szCs w:val="20"/>
+              </w:rPr>
+              <w:t xml:space="preserve">Worked in </w:t>
+            </w:r>
+            <w:proofErr w:type="gramStart"/>
+            <w:r>
+              <w:rPr>
+                <w:rFonts w:ascii="Calibri" w:hAnsi="Calibri" w:cs="Calibri"/>
+                <w:color w:val="000000" w:themeColor="text1"/>
+                <w:sz w:val="20"/>
+                <w:szCs w:val="20"/>
+              </w:rPr>
+              <w:t>Agile</w:t>
+            </w:r>
+            <w:proofErr w:type="gramEnd"/>
+            <w:r>
+              <w:rPr>
+                <w:rFonts w:ascii="Calibri" w:hAnsi="Calibri" w:cs="Calibri"/>
+                <w:color w:val="000000" w:themeColor="text1"/>
+                <w:sz w:val="20"/>
+                <w:szCs w:val="20"/>
+              </w:rPr>
+              <w:t xml:space="preserve"> based environment with daily scrum calls and coordination with team members.</w:t>
             </w:r>
           </w:p>
           <w:p>
@@ -954,15 +944,15 @@
               <w:ind w:left="350" w:right="346"/>
               <w:rPr>
                 <w:rFonts w:ascii="Calibri" w:hAnsi="Calibri" w:cs="Calibri"/>
-                <w:color w:val="FFFFFF" w:themeColor="background1"/>
-                <w:sz w:val="20"/>
-                <w:szCs w:val="20"/>
-              </w:rPr>
-            </w:pPr>
-            <w:r>
-              <w:rPr>
-                <w:rFonts w:ascii="Calibri" w:hAnsi="Calibri" w:cs="Calibri"/>
-                <w:color w:val="FFFFFF" w:themeColor="background1"/>
+                <w:color w:val="000000" w:themeColor="text1"/>
+                <w:sz w:val="20"/>
+                <w:szCs w:val="20"/>
+              </w:rPr>
+            </w:pPr>
+            <w:r>
+              <w:rPr>
+                <w:rFonts w:ascii="Calibri" w:hAnsi="Calibri" w:cs="Calibri"/>
+                <w:color w:val="000000" w:themeColor="text1"/>
                 <w:sz w:val="20"/>
                 <w:szCs w:val="20"/>
               </w:rPr>
@@ -980,15 +970,15 @@
               <w:ind w:left="350" w:right="346"/>
               <w:rPr>
                 <w:rFonts w:ascii="Calibri" w:hAnsi="Calibri" w:cs="Calibri"/>
-                <w:color w:val="FFFFFF" w:themeColor="background1"/>
-                <w:sz w:val="20"/>
-                <w:szCs w:val="20"/>
-              </w:rPr>
-            </w:pPr>
-            <w:r>
-              <w:rPr>
-                <w:rFonts w:ascii="Calibri" w:hAnsi="Calibri" w:cs="Calibri"/>
-                <w:color w:val="FFFFFF" w:themeColor="background1"/>
+                <w:color w:val="000000" w:themeColor="text1"/>
+                <w:sz w:val="20"/>
+                <w:szCs w:val="20"/>
+              </w:rPr>
+            </w:pPr>
+            <w:r>
+              <w:rPr>
+                <w:rFonts w:ascii="Calibri" w:hAnsi="Calibri" w:cs="Calibri"/>
+                <w:color w:val="000000" w:themeColor="text1"/>
                 <w:sz w:val="20"/>
                 <w:szCs w:val="20"/>
               </w:rPr>
@@ -997,7 +987,7 @@
             <w:r>
               <w:rPr>
                 <w:rFonts w:ascii="Calibri" w:hAnsi="Calibri" w:cs="Calibri"/>
-                <w:color w:val="FFFFFF" w:themeColor="background1"/>
+                <w:color w:val="000000" w:themeColor="text1"/>
                 <w:sz w:val="20"/>
                 <w:szCs w:val="20"/>
               </w:rPr>
@@ -1011,7 +1001,7 @@
               <w:rPr>
                 <w:rFonts w:ascii="Calibri" w:hAnsi="Calibri" w:cs="Calibri"/>
                 <w:i/>
-                <w:color w:val="F6F7F1"/>
+                <w:color w:val="000000" w:themeColor="text1"/>
                 <w:w w:val="85"/>
                 <w:sz w:val="20"/>
                 <w:szCs w:val="20"/>
@@ -1021,26 +1011,28 @@
               <w:rPr>
                 <w:rFonts w:ascii="Calibri" w:hAnsi="Calibri" w:cs="Calibri"/>
                 <w:b/>
-                <w:color w:val="F6F7F1"/>
+                <w:color w:val="000000" w:themeColor="text1"/>
               </w:rPr>
               <w:t xml:space="preserve">Sr. PHP Developer, </w:t>
             </w:r>
+            <w:proofErr w:type="spellStart"/>
             <w:r>
               <w:rPr>
                 <w:rFonts w:ascii="Calibri" w:hAnsi="Calibri" w:cs="Calibri"/>
                 <w:i/>
-                <w:color w:val="F6F7F1"/>
+                <w:color w:val="000000" w:themeColor="text1"/>
                 <w:w w:val="85"/>
                 <w:sz w:val="20"/>
                 <w:szCs w:val="20"/>
               </w:rPr>
               <w:t>Softweaver</w:t>
             </w:r>
+            <w:proofErr w:type="spellEnd"/>
             <w:r>
               <w:rPr>
                 <w:rFonts w:ascii="Calibri" w:hAnsi="Calibri" w:cs="Calibri"/>
                 <w:i/>
-                <w:color w:val="F6F7F1"/>
+                <w:color w:val="000000" w:themeColor="text1"/>
                 <w:spacing w:val="-6"/>
                 <w:w w:val="85"/>
                 <w:sz w:val="20"/>
@@ -1052,7 +1044,7 @@
               <w:rPr>
                 <w:rFonts w:ascii="Calibri" w:hAnsi="Calibri" w:cs="Calibri"/>
                 <w:i/>
-                <w:color w:val="F6F7F1"/>
+                <w:color w:val="000000" w:themeColor="text1"/>
                 <w:w w:val="85"/>
                 <w:sz w:val="20"/>
                 <w:szCs w:val="20"/>
@@ -1067,7 +1059,7 @@
               <w:rPr>
                 <w:rFonts w:ascii="Calibri" w:hAnsi="Calibri" w:cs="Calibri"/>
                 <w:i/>
-                <w:color w:val="F6F7F1"/>
+                <w:color w:val="000000" w:themeColor="text1"/>
                 <w:w w:val="85"/>
                 <w:sz w:val="20"/>
                 <w:szCs w:val="20"/>
@@ -1076,7 +1068,7 @@
             <w:r>
               <w:rPr>
                 <w:rFonts w:ascii="Calibri" w:hAnsi="Calibri" w:cs="Calibri"/>
-                <w:color w:val="F6F7F1"/>
+                <w:color w:val="000000" w:themeColor="text1"/>
                 <w:sz w:val="20"/>
                 <w:szCs w:val="20"/>
               </w:rPr>
@@ -1094,15 +1086,15 @@
               <w:ind w:left="350" w:right="547"/>
               <w:rPr>
                 <w:rFonts w:ascii="Calibri" w:hAnsi="Calibri" w:cs="Calibri"/>
-                <w:color w:val="F6F7F1"/>
-                <w:sz w:val="20"/>
-                <w:szCs w:val="20"/>
-              </w:rPr>
-            </w:pPr>
-            <w:r>
-              <w:rPr>
-                <w:rFonts w:ascii="Calibri" w:hAnsi="Calibri" w:cs="Calibri"/>
-                <w:color w:val="F6F7F1"/>
+                <w:color w:val="000000" w:themeColor="text1"/>
+                <w:sz w:val="20"/>
+                <w:szCs w:val="20"/>
+              </w:rPr>
+            </w:pPr>
+            <w:r>
+              <w:rPr>
+                <w:rFonts w:ascii="Calibri" w:hAnsi="Calibri" w:cs="Calibri"/>
+                <w:color w:val="000000" w:themeColor="text1"/>
                 <w:spacing w:val="-4"/>
                 <w:sz w:val="20"/>
                 <w:szCs w:val="20"/>
@@ -1112,7 +1104,7 @@
             <w:r>
               <w:rPr>
                 <w:rFonts w:ascii="Calibri" w:hAnsi="Calibri" w:cs="Calibri"/>
-                <w:color w:val="F6F7F1"/>
+                <w:color w:val="000000" w:themeColor="text1"/>
                 <w:spacing w:val="-16"/>
                 <w:sz w:val="20"/>
                 <w:szCs w:val="20"/>
@@ -1122,7 +1114,7 @@
             <w:r>
               <w:rPr>
                 <w:rFonts w:ascii="Calibri" w:hAnsi="Calibri" w:cs="Calibri"/>
-                <w:color w:val="F6F7F1"/>
+                <w:color w:val="000000" w:themeColor="text1"/>
                 <w:spacing w:val="-4"/>
                 <w:sz w:val="20"/>
                 <w:szCs w:val="20"/>
@@ -1132,7 +1124,7 @@
             <w:r>
               <w:rPr>
                 <w:rFonts w:ascii="Calibri" w:hAnsi="Calibri" w:cs="Calibri"/>
-                <w:color w:val="F6F7F1"/>
+                <w:color w:val="000000" w:themeColor="text1"/>
                 <w:spacing w:val="-14"/>
                 <w:sz w:val="20"/>
                 <w:szCs w:val="20"/>
@@ -1142,7 +1134,7 @@
             <w:r>
               <w:rPr>
                 <w:rFonts w:ascii="Calibri" w:hAnsi="Calibri" w:cs="Calibri"/>
-                <w:color w:val="F6F7F1"/>
+                <w:color w:val="000000" w:themeColor="text1"/>
                 <w:spacing w:val="-4"/>
                 <w:sz w:val="20"/>
                 <w:szCs w:val="20"/>
@@ -1152,7 +1144,7 @@
             <w:r>
               <w:rPr>
                 <w:rFonts w:ascii="Calibri" w:hAnsi="Calibri" w:cs="Calibri"/>
-                <w:color w:val="F6F7F1"/>
+                <w:color w:val="000000" w:themeColor="text1"/>
                 <w:spacing w:val="-14"/>
                 <w:sz w:val="20"/>
                 <w:szCs w:val="20"/>
@@ -1162,7 +1154,7 @@
             <w:r>
               <w:rPr>
                 <w:rFonts w:ascii="Calibri" w:hAnsi="Calibri" w:cs="Calibri"/>
-                <w:color w:val="F6F7F1"/>
+                <w:color w:val="000000" w:themeColor="text1"/>
                 <w:spacing w:val="-4"/>
                 <w:sz w:val="20"/>
                 <w:szCs w:val="20"/>
@@ -1172,7 +1164,7 @@
             <w:r>
               <w:rPr>
                 <w:rFonts w:ascii="Calibri" w:hAnsi="Calibri" w:cs="Calibri"/>
-                <w:color w:val="F6F7F1"/>
+                <w:color w:val="000000" w:themeColor="text1"/>
                 <w:spacing w:val="-14"/>
                 <w:sz w:val="20"/>
                 <w:szCs w:val="20"/>
@@ -1182,7 +1174,7 @@
             <w:r>
               <w:rPr>
                 <w:rFonts w:ascii="Calibri" w:hAnsi="Calibri" w:cs="Calibri"/>
-                <w:color w:val="F6F7F1"/>
+                <w:color w:val="000000" w:themeColor="text1"/>
                 <w:spacing w:val="-4"/>
                 <w:sz w:val="20"/>
                 <w:szCs w:val="20"/>
@@ -1192,7 +1184,7 @@
             <w:r>
               <w:rPr>
                 <w:rFonts w:ascii="Calibri" w:hAnsi="Calibri" w:cs="Calibri"/>
-                <w:color w:val="F6F7F1"/>
+                <w:color w:val="000000" w:themeColor="text1"/>
                 <w:spacing w:val="-14"/>
                 <w:sz w:val="20"/>
                 <w:szCs w:val="20"/>
@@ -1202,7 +1194,7 @@
             <w:r>
               <w:rPr>
                 <w:rFonts w:ascii="Calibri" w:hAnsi="Calibri" w:cs="Calibri"/>
-                <w:color w:val="F6F7F1"/>
+                <w:color w:val="000000" w:themeColor="text1"/>
                 <w:spacing w:val="-4"/>
                 <w:sz w:val="20"/>
                 <w:szCs w:val="20"/>
@@ -1212,7 +1204,7 @@
             <w:r>
               <w:rPr>
                 <w:rFonts w:ascii="Calibri" w:hAnsi="Calibri" w:cs="Calibri"/>
-                <w:color w:val="F6F7F1"/>
+                <w:color w:val="000000" w:themeColor="text1"/>
                 <w:sz w:val="20"/>
                 <w:szCs w:val="20"/>
               </w:rPr>
@@ -1230,15 +1222,15 @@
               <w:ind w:left="350" w:right="547"/>
               <w:rPr>
                 <w:rFonts w:ascii="Calibri" w:hAnsi="Calibri" w:cs="Calibri"/>
-                <w:color w:val="F6F7F1"/>
-                <w:sz w:val="20"/>
-                <w:szCs w:val="20"/>
-              </w:rPr>
-            </w:pPr>
-            <w:r>
-              <w:rPr>
-                <w:rFonts w:ascii="Calibri" w:hAnsi="Calibri" w:cs="Calibri"/>
-                <w:color w:val="F6F7F1"/>
+                <w:color w:val="000000" w:themeColor="text1"/>
+                <w:sz w:val="20"/>
+                <w:szCs w:val="20"/>
+              </w:rPr>
+            </w:pPr>
+            <w:r>
+              <w:rPr>
+                <w:rFonts w:ascii="Calibri" w:hAnsi="Calibri" w:cs="Calibri"/>
+                <w:color w:val="000000" w:themeColor="text1"/>
                 <w:sz w:val="20"/>
                 <w:szCs w:val="20"/>
               </w:rPr>
@@ -1247,7 +1239,7 @@
             <w:r>
               <w:rPr>
                 <w:rFonts w:ascii="Calibri" w:hAnsi="Calibri" w:cs="Calibri"/>
-                <w:color w:val="F6F7F1"/>
+                <w:color w:val="000000" w:themeColor="text1"/>
                 <w:spacing w:val="-14"/>
                 <w:sz w:val="20"/>
                 <w:szCs w:val="20"/>
@@ -1257,7 +1249,7 @@
             <w:r>
               <w:rPr>
                 <w:rFonts w:ascii="Calibri" w:hAnsi="Calibri" w:cs="Calibri"/>
-                <w:color w:val="F6F7F1"/>
+                <w:color w:val="000000" w:themeColor="text1"/>
                 <w:sz w:val="20"/>
                 <w:szCs w:val="20"/>
               </w:rPr>
@@ -1266,7 +1258,7 @@
             <w:r>
               <w:rPr>
                 <w:rFonts w:ascii="Calibri" w:hAnsi="Calibri" w:cs="Calibri"/>
-                <w:color w:val="F6F7F1"/>
+                <w:color w:val="000000" w:themeColor="text1"/>
                 <w:spacing w:val="-14"/>
                 <w:sz w:val="20"/>
                 <w:szCs w:val="20"/>
@@ -1276,7 +1268,7 @@
             <w:r>
               <w:rPr>
                 <w:rFonts w:ascii="Calibri" w:hAnsi="Calibri" w:cs="Calibri"/>
-                <w:color w:val="F6F7F1"/>
+                <w:color w:val="000000" w:themeColor="text1"/>
                 <w:sz w:val="20"/>
                 <w:szCs w:val="20"/>
               </w:rPr>
@@ -1285,7 +1277,7 @@
             <w:r>
               <w:rPr>
                 <w:rFonts w:ascii="Calibri" w:hAnsi="Calibri" w:cs="Calibri"/>
-                <w:color w:val="F6F7F1"/>
+                <w:color w:val="000000" w:themeColor="text1"/>
                 <w:spacing w:val="-14"/>
                 <w:sz w:val="20"/>
                 <w:szCs w:val="20"/>
@@ -1295,7 +1287,7 @@
             <w:r>
               <w:rPr>
                 <w:rFonts w:ascii="Calibri" w:hAnsi="Calibri" w:cs="Calibri"/>
-                <w:color w:val="F6F7F1"/>
+                <w:color w:val="000000" w:themeColor="text1"/>
                 <w:sz w:val="20"/>
                 <w:szCs w:val="20"/>
               </w:rPr>
@@ -1308,7 +1300,7 @@
               <w:ind w:left="29" w:right="547"/>
               <w:rPr>
                 <w:rFonts w:ascii="Calibri" w:hAnsi="Calibri" w:cs="Calibri"/>
-                <w:color w:val="F6F7F1"/>
+                <w:color w:val="000000" w:themeColor="text1"/>
               </w:rPr>
             </w:pPr>
           </w:p>
@@ -1319,7 +1311,7 @@
               <w:rPr>
                 <w:rFonts w:ascii="Calibri" w:hAnsi="Calibri" w:cs="Calibri"/>
                 <w:b/>
-                <w:color w:val="F6F7F1"/>
+                <w:color w:val="000000" w:themeColor="text1"/>
                 <w:spacing w:val="-6"/>
                 <w:sz w:val="20"/>
                 <w:szCs w:val="20"/>
@@ -1329,7 +1321,7 @@
               <w:rPr>
                 <w:rFonts w:ascii="Calibri" w:hAnsi="Calibri" w:cs="Calibri"/>
                 <w:b/>
-                <w:color w:val="F6F7F1"/>
+                <w:color w:val="000000" w:themeColor="text1"/>
                 <w:spacing w:val="-6"/>
               </w:rPr>
               <w:t>PHP</w:t>
@@ -1338,7 +1330,7 @@
               <w:rPr>
                 <w:rFonts w:ascii="Calibri" w:hAnsi="Calibri" w:cs="Calibri"/>
                 <w:b/>
-                <w:color w:val="F6F7F1"/>
+                <w:color w:val="000000" w:themeColor="text1"/>
                 <w:spacing w:val="-7"/>
               </w:rPr>
               <w:t xml:space="preserve"> </w:t>
@@ -1347,31 +1339,24 @@
               <w:rPr>
                 <w:rFonts w:ascii="Calibri" w:hAnsi="Calibri" w:cs="Calibri"/>
                 <w:b/>
-                <w:color w:val="F6F7F1"/>
+                <w:color w:val="000000" w:themeColor="text1"/>
                 <w:spacing w:val="-6"/>
               </w:rPr>
-              <w:t>Developer</w:t>
-            </w:r>
-            <w:r>
-              <w:rPr>
-                <w:rFonts w:ascii="Calibri" w:hAnsi="Calibri" w:cs="Calibri"/>
-                <w:b/>
-                <w:color w:val="F6F7F1"/>
+              <w:t xml:space="preserve">Developer, </w:t>
+            </w:r>
+            <w:proofErr w:type="spellStart"/>
+            <w:r>
+              <w:rPr>
+                <w:rFonts w:ascii="Calibri" w:hAnsi="Calibri" w:cs="Calibri"/>
+                <w:i/>
+                <w:color w:val="000000" w:themeColor="text1"/>
                 <w:spacing w:val="-6"/>
-              </w:rPr>
-              <w:t xml:space="preserve">, </w:t>
-            </w:r>
-            <w:r>
-              <w:rPr>
-                <w:rFonts w:ascii="Calibri" w:hAnsi="Calibri" w:cs="Calibri"/>
-                <w:i/>
-                <w:color w:val="F6F7F1"/>
-                <w:spacing w:val="-6"/>
                 <w:sz w:val="20"/>
                 <w:szCs w:val="20"/>
               </w:rPr>
               <w:t>FutureWorks</w:t>
             </w:r>
+            <w:proofErr w:type="spellEnd"/>
           </w:p>
           <w:p>
             <w:pPr>
@@ -1380,14 +1365,15 @@
               <w:ind w:left="28"/>
               <w:rPr>
                 <w:rFonts w:ascii="Calibri" w:hAnsi="Calibri" w:cs="Calibri"/>
-                <w:sz w:val="20"/>
-                <w:szCs w:val="20"/>
-              </w:rPr>
-            </w:pPr>
-            <w:r>
-              <w:rPr>
-                <w:rFonts w:ascii="Calibri" w:hAnsi="Calibri" w:cs="Calibri"/>
-                <w:color w:val="F6F7F1"/>
+                <w:color w:val="000000" w:themeColor="text1"/>
+                <w:sz w:val="20"/>
+                <w:szCs w:val="20"/>
+              </w:rPr>
+            </w:pPr>
+            <w:r>
+              <w:rPr>
+                <w:rFonts w:ascii="Calibri" w:hAnsi="Calibri" w:cs="Calibri"/>
+                <w:color w:val="000000" w:themeColor="text1"/>
                 <w:spacing w:val="-4"/>
                 <w:sz w:val="20"/>
                 <w:szCs w:val="20"/>
@@ -1397,7 +1383,7 @@
             <w:r>
               <w:rPr>
                 <w:rFonts w:ascii="Calibri" w:hAnsi="Calibri" w:cs="Calibri"/>
-                <w:color w:val="F6F7F1"/>
+                <w:color w:val="000000" w:themeColor="text1"/>
                 <w:spacing w:val="-9"/>
                 <w:sz w:val="20"/>
                 <w:szCs w:val="20"/>
@@ -1407,7 +1393,7 @@
             <w:r>
               <w:rPr>
                 <w:rFonts w:ascii="Calibri" w:hAnsi="Calibri" w:cs="Calibri"/>
-                <w:color w:val="F6F7F1"/>
+                <w:color w:val="000000" w:themeColor="text1"/>
                 <w:spacing w:val="-4"/>
                 <w:sz w:val="20"/>
                 <w:szCs w:val="20"/>
@@ -1417,7 +1403,7 @@
             <w:r>
               <w:rPr>
                 <w:rFonts w:ascii="Calibri" w:hAnsi="Calibri" w:cs="Calibri"/>
-                <w:color w:val="F6F7F1"/>
+                <w:color w:val="000000" w:themeColor="text1"/>
                 <w:spacing w:val="-9"/>
                 <w:sz w:val="20"/>
                 <w:szCs w:val="20"/>
@@ -1427,7 +1413,7 @@
             <w:r>
               <w:rPr>
                 <w:rFonts w:ascii="Calibri" w:hAnsi="Calibri" w:cs="Calibri"/>
-                <w:color w:val="F6F7F1"/>
+                <w:color w:val="000000" w:themeColor="text1"/>
                 <w:spacing w:val="-4"/>
                 <w:sz w:val="20"/>
                 <w:szCs w:val="20"/>
@@ -1446,15 +1432,15 @@
               <w:ind w:left="350" w:right="396"/>
               <w:rPr>
                 <w:rFonts w:ascii="Calibri" w:hAnsi="Calibri" w:cs="Calibri"/>
-                <w:color w:val="F6F7F1"/>
-                <w:sz w:val="20"/>
-                <w:szCs w:val="20"/>
-              </w:rPr>
-            </w:pPr>
-            <w:r>
-              <w:rPr>
-                <w:rFonts w:ascii="Calibri" w:hAnsi="Calibri" w:cs="Calibri"/>
-                <w:color w:val="F6F7F1"/>
+                <w:color w:val="000000" w:themeColor="text1"/>
+                <w:sz w:val="20"/>
+                <w:szCs w:val="20"/>
+              </w:rPr>
+            </w:pPr>
+            <w:r>
+              <w:rPr>
+                <w:rFonts w:ascii="Calibri" w:hAnsi="Calibri" w:cs="Calibri"/>
+                <w:color w:val="000000" w:themeColor="text1"/>
                 <w:sz w:val="20"/>
                 <w:szCs w:val="20"/>
               </w:rPr>
@@ -1472,15 +1458,15 @@
               <w:ind w:left="350" w:right="396"/>
               <w:rPr>
                 <w:rFonts w:ascii="Calibri" w:hAnsi="Calibri" w:cs="Calibri"/>
-                <w:color w:val="F6F7F1"/>
-                <w:sz w:val="20"/>
-                <w:szCs w:val="20"/>
-              </w:rPr>
-            </w:pPr>
-            <w:r>
-              <w:rPr>
-                <w:rFonts w:ascii="Calibri" w:hAnsi="Calibri" w:cs="Calibri"/>
-                <w:color w:val="F6F7F1"/>
+                <w:color w:val="000000" w:themeColor="text1"/>
+                <w:sz w:val="20"/>
+                <w:szCs w:val="20"/>
+              </w:rPr>
+            </w:pPr>
+            <w:r>
+              <w:rPr>
+                <w:rFonts w:ascii="Calibri" w:hAnsi="Calibri" w:cs="Calibri"/>
+                <w:color w:val="000000" w:themeColor="text1"/>
                 <w:sz w:val="20"/>
                 <w:szCs w:val="20"/>
               </w:rPr>
@@ -1489,7 +1475,7 @@
             <w:r>
               <w:rPr>
                 <w:rFonts w:ascii="Calibri" w:hAnsi="Calibri" w:cs="Calibri"/>
-                <w:color w:val="F6F7F1"/>
+                <w:color w:val="000000" w:themeColor="text1"/>
                 <w:spacing w:val="-2"/>
                 <w:sz w:val="20"/>
                 <w:szCs w:val="20"/>
@@ -1499,7 +1485,7 @@
             <w:r>
               <w:rPr>
                 <w:rFonts w:ascii="Calibri" w:hAnsi="Calibri" w:cs="Calibri"/>
-                <w:color w:val="F6F7F1"/>
+                <w:color w:val="000000" w:themeColor="text1"/>
                 <w:spacing w:val="-14"/>
                 <w:sz w:val="20"/>
                 <w:szCs w:val="20"/>
@@ -1509,7 +1495,7 @@
             <w:r>
               <w:rPr>
                 <w:rFonts w:ascii="Calibri" w:hAnsi="Calibri" w:cs="Calibri"/>
-                <w:color w:val="F6F7F1"/>
+                <w:color w:val="000000" w:themeColor="text1"/>
                 <w:spacing w:val="-2"/>
                 <w:sz w:val="20"/>
                 <w:szCs w:val="20"/>
@@ -1519,7 +1505,7 @@
             <w:r>
               <w:rPr>
                 <w:rFonts w:ascii="Calibri" w:hAnsi="Calibri" w:cs="Calibri"/>
-                <w:color w:val="F6F7F1"/>
+                <w:color w:val="000000" w:themeColor="text1"/>
                 <w:spacing w:val="-14"/>
                 <w:sz w:val="20"/>
                 <w:szCs w:val="20"/>
@@ -1529,7 +1515,7 @@
             <w:r>
               <w:rPr>
                 <w:rFonts w:ascii="Calibri" w:hAnsi="Calibri" w:cs="Calibri"/>
-                <w:color w:val="F6F7F1"/>
+                <w:color w:val="000000" w:themeColor="text1"/>
                 <w:spacing w:val="-2"/>
                 <w:sz w:val="20"/>
                 <w:szCs w:val="20"/>
@@ -1539,7 +1525,7 @@
             <w:r>
               <w:rPr>
                 <w:rFonts w:ascii="Calibri" w:hAnsi="Calibri" w:cs="Calibri"/>
-                <w:color w:val="F6F7F1"/>
+                <w:color w:val="000000" w:themeColor="text1"/>
                 <w:spacing w:val="-14"/>
                 <w:sz w:val="20"/>
                 <w:szCs w:val="20"/>
@@ -1549,7 +1535,7 @@
             <w:r>
               <w:rPr>
                 <w:rFonts w:ascii="Calibri" w:hAnsi="Calibri" w:cs="Calibri"/>
-                <w:color w:val="F6F7F1"/>
+                <w:color w:val="000000" w:themeColor="text1"/>
                 <w:spacing w:val="-2"/>
                 <w:sz w:val="20"/>
                 <w:szCs w:val="20"/>
@@ -1559,7 +1545,7 @@
             <w:r>
               <w:rPr>
                 <w:rFonts w:ascii="Calibri" w:hAnsi="Calibri" w:cs="Calibri"/>
-                <w:color w:val="F6F7F1"/>
+                <w:color w:val="000000" w:themeColor="text1"/>
                 <w:sz w:val="20"/>
                 <w:szCs w:val="20"/>
               </w:rPr>
@@ -1568,7 +1554,7 @@
             <w:r>
               <w:rPr>
                 <w:rFonts w:ascii="Calibri" w:hAnsi="Calibri" w:cs="Calibri"/>
-                <w:color w:val="F6F7F1"/>
+                <w:color w:val="000000" w:themeColor="text1"/>
                 <w:spacing w:val="-14"/>
                 <w:sz w:val="20"/>
                 <w:szCs w:val="20"/>
@@ -1578,7 +1564,7 @@
             <w:r>
               <w:rPr>
                 <w:rFonts w:ascii="Calibri" w:hAnsi="Calibri" w:cs="Calibri"/>
-                <w:color w:val="F6F7F1"/>
+                <w:color w:val="000000" w:themeColor="text1"/>
                 <w:sz w:val="20"/>
                 <w:szCs w:val="20"/>
               </w:rPr>
@@ -1587,7 +1573,7 @@
             <w:r>
               <w:rPr>
                 <w:rFonts w:ascii="Calibri" w:hAnsi="Calibri" w:cs="Calibri"/>
-                <w:color w:val="F6F7F1"/>
+                <w:color w:val="000000" w:themeColor="text1"/>
                 <w:spacing w:val="-14"/>
                 <w:sz w:val="20"/>
                 <w:szCs w:val="20"/>
@@ -1597,7 +1583,7 @@
             <w:r>
               <w:rPr>
                 <w:rFonts w:ascii="Calibri" w:hAnsi="Calibri" w:cs="Calibri"/>
-                <w:color w:val="F6F7F1"/>
+                <w:color w:val="000000" w:themeColor="text1"/>
                 <w:sz w:val="20"/>
                 <w:szCs w:val="20"/>
               </w:rPr>
@@ -1611,7 +1597,7 @@
               <w:rPr>
                 <w:rFonts w:ascii="Calibri" w:hAnsi="Calibri" w:cs="Calibri"/>
                 <w:b/>
-                <w:color w:val="F6F7F1"/>
+                <w:color w:val="000000" w:themeColor="text1"/>
                 <w:spacing w:val="-6"/>
                 <w:sz w:val="20"/>
                 <w:szCs w:val="20"/>
@@ -1621,7 +1607,7 @@
               <w:rPr>
                 <w:rFonts w:ascii="Calibri" w:hAnsi="Calibri" w:cs="Calibri"/>
                 <w:b/>
-                <w:color w:val="F6F7F1"/>
+                <w:color w:val="000000" w:themeColor="text1"/>
                 <w:spacing w:val="-6"/>
                 <w:sz w:val="20"/>
                 <w:szCs w:val="20"/>
@@ -1636,7 +1622,7 @@
               <w:rPr>
                 <w:rFonts w:ascii="Calibri" w:hAnsi="Calibri" w:cs="Calibri"/>
                 <w:b/>
-                <w:color w:val="F6F7F1"/>
+                <w:color w:val="000000" w:themeColor="text1"/>
                 <w:spacing w:val="-6"/>
                 <w:sz w:val="20"/>
                 <w:szCs w:val="20"/>
@@ -1650,7 +1636,7 @@
               <w:rPr>
                 <w:rFonts w:ascii="Calibri" w:hAnsi="Calibri" w:cs="Calibri"/>
                 <w:b/>
-                <w:color w:val="F6F7F1"/>
+                <w:color w:val="000000" w:themeColor="text1"/>
                 <w:spacing w:val="-6"/>
                 <w:sz w:val="20"/>
                 <w:szCs w:val="20"/>
@@ -1664,7 +1650,7 @@
               <w:rPr>
                 <w:rFonts w:ascii="Calibri" w:hAnsi="Calibri" w:cs="Calibri"/>
                 <w:b/>
-                <w:color w:val="F6F7F1"/>
+                <w:color w:val="000000" w:themeColor="text1"/>
                 <w:spacing w:val="-6"/>
                 <w:sz w:val="20"/>
                 <w:szCs w:val="20"/>
@@ -1678,28 +1664,70 @@
               <w:rPr>
                 <w:rFonts w:ascii="Calibri" w:hAnsi="Calibri" w:cs="Calibri"/>
                 <w:b/>
-                <w:color w:val="F6F7F1"/>
+                <w:color w:val="000000" w:themeColor="text1"/>
                 <w:spacing w:val="-6"/>
                 <w:sz w:val="20"/>
                 <w:szCs w:val="20"/>
               </w:rPr>
             </w:pPr>
-            <w:r>
+          </w:p>
+          <w:p>
+            <w:pPr>
+              <w:spacing w:line="271" w:lineRule="auto"/>
+              <w:ind w:right="547"/>
               <w:rPr>
                 <w:rFonts w:ascii="Calibri" w:hAnsi="Calibri" w:cs="Calibri"/>
                 <w:b/>
-                <w:color w:val="F6F7F1"/>
+                <w:color w:val="000000" w:themeColor="text1"/>
                 <w:spacing w:val="-6"/>
                 <w:sz w:val="20"/>
                 <w:szCs w:val="20"/>
               </w:rPr>
+            </w:pPr>
+          </w:p>
+          <w:p>
+            <w:pPr>
+              <w:spacing w:line="271" w:lineRule="auto"/>
+              <w:ind w:right="547"/>
+              <w:rPr>
+                <w:rFonts w:ascii="Calibri" w:hAnsi="Calibri" w:cs="Calibri"/>
+                <w:b/>
+                <w:color w:val="000000" w:themeColor="text1"/>
+                <w:spacing w:val="-6"/>
+                <w:sz w:val="20"/>
+                <w:szCs w:val="20"/>
+              </w:rPr>
+            </w:pPr>
+          </w:p>
+          <w:p>
+            <w:pPr>
+              <w:spacing w:line="271" w:lineRule="auto"/>
+              <w:ind w:right="547"/>
+              <w:rPr>
+                <w:rFonts w:ascii="Calibri" w:hAnsi="Calibri" w:cs="Calibri"/>
+                <w:b/>
+                <w:color w:val="000000" w:themeColor="text1"/>
+                <w:spacing w:val="-6"/>
+                <w:sz w:val="20"/>
+                <w:szCs w:val="20"/>
+              </w:rPr>
+            </w:pPr>
+            <w:r>
+              <w:rPr>
+                <w:rFonts w:ascii="Calibri" w:hAnsi="Calibri" w:cs="Calibri"/>
+                <w:b/>
+                <w:color w:val="000000" w:themeColor="text1"/>
+                <w:spacing w:val="-6"/>
+                <w:sz w:val="20"/>
+                <w:szCs w:val="20"/>
+              </w:rPr>
               <w:t>Junior</w:t>
             </w:r>
             <w:r>
               <w:rPr>
                 <w:rFonts w:ascii="Calibri" w:hAnsi="Calibri" w:cs="Calibri"/>
                 <w:b/>
-                <w:color w:val="F6F7F1"/>
+                <w:color w:val="000000" w:themeColor="text1"/>
                 <w:spacing w:val="-13"/>
                 <w:sz w:val="20"/>
                 <w:szCs w:val="20"/>
@@ -1710,7 +1738,7 @@
               <w:rPr>
                 <w:rFonts w:ascii="Calibri" w:hAnsi="Calibri" w:cs="Calibri"/>
                 <w:b/>
-                <w:color w:val="F6F7F1"/>
+                <w:color w:val="000000" w:themeColor="text1"/>
                 <w:spacing w:val="-6"/>
                 <w:sz w:val="20"/>
                 <w:szCs w:val="20"/>
@@ -1721,7 +1749,7 @@
               <w:rPr>
                 <w:rFonts w:ascii="Calibri" w:hAnsi="Calibri" w:cs="Calibri"/>
                 <w:b/>
-                <w:color w:val="F6F7F1"/>
+                <w:color w:val="000000" w:themeColor="text1"/>
                 <w:spacing w:val="-13"/>
                 <w:sz w:val="20"/>
                 <w:szCs w:val="20"/>
@@ -1732,7 +1760,7 @@
               <w:rPr>
                 <w:rFonts w:ascii="Calibri" w:hAnsi="Calibri" w:cs="Calibri"/>
                 <w:b/>
-                <w:color w:val="F6F7F1"/>
+                <w:color w:val="000000" w:themeColor="text1"/>
                 <w:spacing w:val="-6"/>
                 <w:sz w:val="20"/>
                 <w:szCs w:val="20"/>
@@ -1743,7 +1771,7 @@
               <w:rPr>
                 <w:rFonts w:ascii="Calibri" w:hAnsi="Calibri" w:cs="Calibri"/>
                 <w:i/>
-                <w:color w:val="F6F7F1"/>
+                <w:color w:val="000000" w:themeColor="text1"/>
                 <w:spacing w:val="-2"/>
                 <w:sz w:val="20"/>
                 <w:szCs w:val="20"/>
@@ -1757,14 +1785,15 @@
               <w:ind w:left="29" w:right="547"/>
               <w:rPr>
                 <w:rFonts w:ascii="Calibri" w:hAnsi="Calibri" w:cs="Calibri"/>
-                <w:sz w:val="20"/>
-                <w:szCs w:val="20"/>
-              </w:rPr>
-            </w:pPr>
-            <w:r>
-              <w:rPr>
-                <w:rFonts w:ascii="Calibri" w:hAnsi="Calibri" w:cs="Calibri"/>
-                <w:color w:val="F6F7F1"/>
+                <w:color w:val="000000" w:themeColor="text1"/>
+                <w:sz w:val="20"/>
+                <w:szCs w:val="20"/>
+              </w:rPr>
+            </w:pPr>
+            <w:r>
+              <w:rPr>
+                <w:rFonts w:ascii="Calibri" w:hAnsi="Calibri" w:cs="Calibri"/>
+                <w:color w:val="000000" w:themeColor="text1"/>
                 <w:sz w:val="20"/>
                 <w:szCs w:val="20"/>
               </w:rPr>
@@ -1782,15 +1811,15 @@
               <w:ind w:left="350" w:right="396"/>
               <w:rPr>
                 <w:rFonts w:ascii="Calibri" w:hAnsi="Calibri" w:cs="Calibri"/>
-                <w:color w:val="F6F7F1"/>
-                <w:sz w:val="20"/>
-                <w:szCs w:val="20"/>
-              </w:rPr>
-            </w:pPr>
-            <w:r>
-              <w:rPr>
-                <w:rFonts w:ascii="Calibri" w:hAnsi="Calibri" w:cs="Calibri"/>
-                <w:color w:val="F6F7F1"/>
+                <w:color w:val="000000" w:themeColor="text1"/>
+                <w:sz w:val="20"/>
+                <w:szCs w:val="20"/>
+              </w:rPr>
+            </w:pPr>
+            <w:r>
+              <w:rPr>
+                <w:rFonts w:ascii="Calibri" w:hAnsi="Calibri" w:cs="Calibri"/>
+                <w:color w:val="000000" w:themeColor="text1"/>
                 <w:sz w:val="20"/>
                 <w:szCs w:val="20"/>
               </w:rPr>
@@ -1808,15 +1837,15 @@
               <w:ind w:left="350" w:right="396"/>
               <w:rPr>
                 <w:rFonts w:ascii="Calibri" w:hAnsi="Calibri" w:cs="Calibri"/>
-                <w:color w:val="F6F7F1"/>
-                <w:sz w:val="20"/>
-                <w:szCs w:val="20"/>
-              </w:rPr>
-            </w:pPr>
-            <w:r>
-              <w:rPr>
-                <w:rFonts w:ascii="Calibri" w:hAnsi="Calibri" w:cs="Calibri"/>
-                <w:color w:val="F6F7F1"/>
+                <w:color w:val="000000" w:themeColor="text1"/>
+                <w:sz w:val="20"/>
+                <w:szCs w:val="20"/>
+              </w:rPr>
+            </w:pPr>
+            <w:r>
+              <w:rPr>
+                <w:rFonts w:ascii="Calibri" w:hAnsi="Calibri" w:cs="Calibri"/>
+                <w:color w:val="000000" w:themeColor="text1"/>
                 <w:sz w:val="20"/>
                 <w:szCs w:val="20"/>
               </w:rPr>
@@ -1825,7 +1854,7 @@
             <w:r>
               <w:rPr>
                 <w:rFonts w:ascii="Calibri" w:hAnsi="Calibri" w:cs="Calibri"/>
-                <w:color w:val="F6F7F1"/>
+                <w:color w:val="000000" w:themeColor="text1"/>
                 <w:sz w:val="20"/>
                 <w:szCs w:val="20"/>
               </w:rPr>
@@ -1839,7 +1868,7 @@
               <w:ind w:left="28"/>
               <w:rPr>
                 <w:rFonts w:ascii="Calibri" w:hAnsi="Calibri" w:cs="Calibri"/>
-                <w:color w:val="F6F7F1"/>
+                <w:color w:val="000000" w:themeColor="text1"/>
                 <w:sz w:val="20"/>
                 <w:szCs w:val="20"/>
               </w:rPr>
@@ -1852,7 +1881,7 @@
               <w:ind w:left="28"/>
               <w:rPr>
                 <w:rFonts w:ascii="Calibri" w:hAnsi="Calibri" w:cs="Calibri"/>
-                <w:color w:val="F6F7F1"/>
+                <w:color w:val="000000" w:themeColor="text1"/>
                 <w:sz w:val="20"/>
                 <w:szCs w:val="20"/>
               </w:rPr>
@@ -1865,7 +1894,7 @@
               <w:ind w:left="28"/>
               <w:rPr>
                 <w:rFonts w:ascii="Calibri" w:hAnsi="Calibri" w:cs="Calibri"/>
-                <w:color w:val="F6F7F1"/>
+                <w:color w:val="000000" w:themeColor="text1"/>
                 <w:sz w:val="20"/>
                 <w:szCs w:val="20"/>
               </w:rPr>
@@ -1878,7 +1907,7 @@
               <w:ind w:left="28"/>
               <w:rPr>
                 <w:rFonts w:ascii="Calibri" w:hAnsi="Calibri" w:cs="Calibri"/>
-                <w:color w:val="F6F7F1"/>
+                <w:color w:val="000000" w:themeColor="text1"/>
                 <w:sz w:val="20"/>
                 <w:szCs w:val="20"/>
               </w:rPr>
@@ -1891,6 +1920,7 @@
               <w:ind w:left="28"/>
               <w:rPr>
                 <w:rFonts w:ascii="Calibri" w:hAnsi="Calibri" w:cs="Calibri"/>
+                <w:color w:val="000000" w:themeColor="text1"/>
                 <w:sz w:val="20"/>
                 <w:szCs w:val="20"/>
               </w:rPr>
@@ -1903,6 +1933,7 @@
               <w:ind w:left="28"/>
               <w:rPr>
                 <w:rFonts w:ascii="Calibri" w:hAnsi="Calibri" w:cs="Calibri"/>
+                <w:color w:val="000000" w:themeColor="text1"/>
                 <w:sz w:val="20"/>
                 <w:szCs w:val="20"/>
               </w:rPr>
@@ -1915,6 +1946,7 @@
               <w:ind w:left="28"/>
               <w:rPr>
                 <w:rFonts w:ascii="Calibri" w:hAnsi="Calibri" w:cs="Calibri"/>
+                <w:color w:val="000000" w:themeColor="text1"/>
                 <w:sz w:val="20"/>
                 <w:szCs w:val="20"/>
               </w:rPr>
@@ -1927,6 +1959,7 @@
               <w:ind w:left="28"/>
               <w:rPr>
                 <w:rFonts w:ascii="Calibri" w:hAnsi="Calibri" w:cs="Calibri"/>
+                <w:color w:val="000000" w:themeColor="text1"/>
                 <w:sz w:val="20"/>
                 <w:szCs w:val="20"/>
               </w:rPr>
@@ -1939,6 +1972,7 @@
               <w:ind w:left="28"/>
               <w:rPr>
                 <w:rFonts w:ascii="Calibri" w:hAnsi="Calibri" w:cs="Calibri"/>
+                <w:color w:val="000000" w:themeColor="text1"/>
                 <w:sz w:val="20"/>
                 <w:szCs w:val="20"/>
               </w:rPr>
@@ -1951,6 +1985,7 @@
               <w:ind w:left="28"/>
               <w:rPr>
                 <w:rFonts w:ascii="Calibri" w:hAnsi="Calibri" w:cs="Calibri"/>
+                <w:color w:val="000000" w:themeColor="text1"/>
                 <w:sz w:val="20"/>
                 <w:szCs w:val="20"/>
               </w:rPr>
@@ -1963,6 +1998,7 @@
               <w:ind w:left="28"/>
               <w:rPr>
                 <w:rFonts w:ascii="Calibri" w:hAnsi="Calibri" w:cs="Calibri"/>
+                <w:color w:val="000000" w:themeColor="text1"/>
                 <w:sz w:val="20"/>
                 <w:szCs w:val="20"/>
               </w:rPr>
@@ -2097,8 +2133,8 @@
               <w:rPr>
                 <w:rFonts w:ascii="Calibri" w:hAnsi="Calibri" w:cs="Calibri"/>
                 <w:color w:val="auto"/>
-                <w:sz w:val="22"/>
-                <w:szCs w:val="22"/>
+                <w:sz w:val="28"/>
+                <w:szCs w:val="28"/>
               </w:rPr>
             </w:pPr>
             <w:r>
@@ -2111,167 +2147,286 @@
               <w:t>Software Developer</w:t>
             </w:r>
           </w:p>
-          <w:p>
-            <w:pPr>
-              <w:pStyle w:val="Heading1"/>
-              <w:spacing w:before="0" w:after="0"/>
-              <w:ind w:left="29"/>
-              <w:rPr>
-                <w:rFonts w:ascii="Calibri" w:hAnsi="Calibri" w:cs="Calibri"/>
-                <w:color w:val="auto"/>
-              </w:rPr>
-            </w:pPr>
-            <w:r>
-              <w:rPr>
-                <w:rFonts w:ascii="Calibri" w:hAnsi="Calibri" w:cs="Calibri"/>
-                <w:b/>
-                <w:noProof/>
-                <w:color w:val="auto"/>
-                <w:sz w:val="22"/>
-                <w:szCs w:val="22"/>
-              </w:rPr>
-              <w:drawing>
-                <wp:inline distT="0" distB="0" distL="0" distR="0" wp14:anchorId="75C57C82" wp14:editId="34466B8E">
-                  <wp:extent cx="152400" cy="152400"/>
-                  <wp:effectExtent l="0" t="0" r="0" b="0"/>
-                  <wp:docPr id="1077106486" name="Graphic 15" descr="Phone Vibration with solid fill"/>
-                  <wp:cNvGraphicFramePr>
-                    <a:graphicFrameLocks xmlns:a="http://schemas.openxmlformats.org/drawingml/2006/main" noChangeAspect="1"/>
-                  </wp:cNvGraphicFramePr>
-                  <a:graphic xmlns:a="http://schemas.openxmlformats.org/drawingml/2006/main">
-                    <a:graphicData uri="http://schemas.openxmlformats.org/drawingml/2006/picture">
-                      <pic:pic xmlns:pic="http://schemas.openxmlformats.org/drawingml/2006/picture">
-                        <pic:nvPicPr>
-                          <pic:cNvPr id="1077106486" name="Graphic 1077106486" descr="Phone Vibration with solid fill"/>
-                          <pic:cNvPicPr/>
-                        </pic:nvPicPr>
-                        <pic:blipFill>
-                          <a:blip r:embed="rId5">
-                            <a:extLst>
-                              <a:ext uri="{96DAC541-7B7A-43D3-8B79-37D633B846F1}">
-                                <asvg:svgBlip xmlns:asvg="http://schemas.microsoft.com/office/drawing/2016/SVG/main" r:embed="rId6"/>
-                              </a:ext>
-                            </a:extLst>
-                          </a:blip>
-                          <a:stretch>
-                            <a:fillRect/>
-                          </a:stretch>
-                        </pic:blipFill>
-                        <pic:spPr>
-                          <a:xfrm>
-                            <a:off x="0" y="0"/>
-                            <a:ext cx="152400" cy="152400"/>
-                          </a:xfrm>
-                          <a:prstGeom prst="rect">
-                            <a:avLst/>
-                          </a:prstGeom>
-                        </pic:spPr>
-                      </pic:pic>
-                    </a:graphicData>
-                  </a:graphic>
-                </wp:inline>
-              </w:drawing>
-            </w:r>
-            <w:r>
-              <w:rPr>
-                <w:rFonts w:ascii="Calibri" w:hAnsi="Calibri" w:cs="Calibri"/>
-                <w:color w:val="auto"/>
-                <w:sz w:val="20"/>
-                <w:szCs w:val="20"/>
-              </w:rPr>
-              <w:t>+</w:t>
-            </w:r>
-            <w:r>
-              <w:rPr>
-                <w:rFonts w:ascii="Calibri" w:hAnsi="Calibri" w:cs="Calibri"/>
-                <w:color w:val="auto"/>
-                <w:sz w:val="20"/>
-                <w:szCs w:val="20"/>
-              </w:rPr>
-              <w:t>9</w:t>
-            </w:r>
-            <w:r>
-              <w:rPr>
-                <w:rFonts w:ascii="Calibri" w:hAnsi="Calibri" w:cs="Calibri"/>
-                <w:color w:val="auto"/>
-                <w:sz w:val="20"/>
-                <w:szCs w:val="20"/>
-              </w:rPr>
-              <w:t xml:space="preserve">1-904-1381-050      </w:t>
-            </w:r>
-            <w:r>
-              <w:rPr>
-                <w:rFonts w:ascii="Calibri" w:hAnsi="Calibri" w:cs="Calibri"/>
-                <w:b/>
-                <w:noProof/>
-                <w:color w:val="auto"/>
-                <w:sz w:val="22"/>
-                <w:szCs w:val="22"/>
-              </w:rPr>
-              <w:drawing>
-                <wp:inline distT="0" distB="0" distL="0" distR="0" wp14:anchorId="0C9908D2" wp14:editId="65F418C8">
-                  <wp:extent cx="146050" cy="146050"/>
-                  <wp:effectExtent l="0" t="0" r="6350" b="6350"/>
-                  <wp:docPr id="1249126898" name="Graphic 16" descr="Email with solid fill"/>
-                  <wp:cNvGraphicFramePr>
-                    <a:graphicFrameLocks xmlns:a="http://schemas.openxmlformats.org/drawingml/2006/main" noChangeAspect="1"/>
-                  </wp:cNvGraphicFramePr>
-                  <a:graphic xmlns:a="http://schemas.openxmlformats.org/drawingml/2006/main">
-                    <a:graphicData uri="http://schemas.openxmlformats.org/drawingml/2006/picture">
-                      <pic:pic xmlns:pic="http://schemas.openxmlformats.org/drawingml/2006/picture">
-                        <pic:nvPicPr>
-                          <pic:cNvPr id="1249126898" name="Graphic 1249126898" descr="Email with solid fill"/>
-                          <pic:cNvPicPr/>
-                        </pic:nvPicPr>
-                        <pic:blipFill>
-                          <a:blip r:embed="rId7">
-                            <a:extLst>
-                              <a:ext uri="{96DAC541-7B7A-43D3-8B79-37D633B846F1}">
-                                <asvg:svgBlip xmlns:asvg="http://schemas.microsoft.com/office/drawing/2016/SVG/main" r:embed="rId8"/>
-                              </a:ext>
-                            </a:extLst>
-                          </a:blip>
-                          <a:stretch>
-                            <a:fillRect/>
-                          </a:stretch>
-                        </pic:blipFill>
-                        <pic:spPr>
-                          <a:xfrm>
-                            <a:off x="0" y="0"/>
-                            <a:ext cx="146050" cy="146050"/>
-                          </a:xfrm>
-                          <a:prstGeom prst="rect">
-                            <a:avLst/>
-                          </a:prstGeom>
-                        </pic:spPr>
-                      </pic:pic>
-                    </a:graphicData>
-                  </a:graphic>
-                </wp:inline>
-              </w:drawing>
-            </w:r>
-            <w:r>
-              <w:rPr>
-                <w:rFonts w:ascii="Calibri" w:hAnsi="Calibri" w:cs="Calibri"/>
-                <w:color w:val="auto"/>
-                <w:sz w:val="20"/>
-                <w:szCs w:val="20"/>
-              </w:rPr>
-              <w:t xml:space="preserve"> </w:t>
-            </w:r>
-            <w:hyperlink r:id="rId9" w:history="1">
-              <w:r>
-                <w:rPr>
-                  <w:rStyle w:val="Hyperlink"/>
-                  <w:rFonts w:ascii="Calibri" w:hAnsi="Calibri" w:cs="Calibri"/>
-                  <w:color w:val="auto"/>
-                  <w:sz w:val="20"/>
-                  <w:szCs w:val="20"/>
-                </w:rPr>
-                <w:t>tarunkuma07@gmail.com</w:t>
-              </w:r>
-            </w:hyperlink>
-          </w:p>
+          <w:tbl>
+            <w:tblPr>
+              <w:tblStyle w:val="TableGrid"/>
+              <w:tblW w:w="0" w:type="auto"/>
+              <w:tblBorders>
+                <w:top w:val="none" w:sz="0" w:space="0" w:color="auto"/>
+                <w:left w:val="none" w:sz="0" w:space="0" w:color="auto"/>
+                <w:bottom w:val="none" w:sz="0" w:space="0" w:color="auto"/>
+                <w:right w:val="none" w:sz="0" w:space="0" w:color="auto"/>
+                <w:insideH w:val="none" w:sz="0" w:space="0" w:color="auto"/>
+                <w:insideV w:val="none" w:sz="0" w:space="0" w:color="auto"/>
+              </w:tblBorders>
+              <w:tblLook w:val="04A0" w:firstRow="1" w:lastRow="0" w:firstColumn="1" w:lastColumn="0" w:noHBand="0" w:noVBand="1"/>
+            </w:tblPr>
+            <w:tblGrid>
+              <w:gridCol w:w="566"/>
+              <w:gridCol w:w="2139"/>
+              <w:gridCol w:w="456"/>
+              <w:gridCol w:w="3034"/>
+            </w:tblGrid>
+            <w:tr>
+              <w:tc>
+                <w:tcPr>
+                  <w:tcW w:w="566" w:type="dxa"/>
+                </w:tcPr>
+                <w:p>
+                  <w:r>
+                    <w:rPr>
+                      <w:rFonts w:ascii="Calibri" w:hAnsi="Calibri" w:cs="Calibri"/>
+                      <w:b/>
+                      <w:noProof/>
+                    </w:rPr>
+                    <w:drawing>
+                      <wp:inline distT="0" distB="0" distL="0" distR="0" wp14:anchorId="1EC81B62" wp14:editId="7DCF41E2">
+                        <wp:extent cx="152400" cy="152400"/>
+                        <wp:effectExtent l="0" t="0" r="0" b="0"/>
+                        <wp:docPr id="1077106486" name="Graphic 15" descr="Phone Vibration with solid fill"/>
+                        <wp:cNvGraphicFramePr>
+                          <a:graphicFrameLocks xmlns:a="http://schemas.openxmlformats.org/drawingml/2006/main" noChangeAspect="1"/>
+                        </wp:cNvGraphicFramePr>
+                        <a:graphic xmlns:a="http://schemas.openxmlformats.org/drawingml/2006/main">
+                          <a:graphicData uri="http://schemas.openxmlformats.org/drawingml/2006/picture">
+                            <pic:pic xmlns:pic="http://schemas.openxmlformats.org/drawingml/2006/picture">
+                              <pic:nvPicPr>
+                                <pic:cNvPr id="1077106486" name="Graphic 1077106486" descr="Phone Vibration with solid fill"/>
+                                <pic:cNvPicPr/>
+                              </pic:nvPicPr>
+                              <pic:blipFill>
+                                <a:blip r:embed="rId5">
+                                  <a:extLst>
+                                    <a:ext uri="{96DAC541-7B7A-43D3-8B79-37D633B846F1}">
+                                      <asvg:svgBlip xmlns:asvg="http://schemas.microsoft.com/office/drawing/2016/SVG/main" r:embed="rId6"/>
+                                    </a:ext>
+                                  </a:extLst>
+                                </a:blip>
+                                <a:stretch>
+                                  <a:fillRect/>
+                                </a:stretch>
+                              </pic:blipFill>
+                              <pic:spPr>
+                                <a:xfrm>
+                                  <a:off x="0" y="0"/>
+                                  <a:ext cx="152400" cy="152400"/>
+                                </a:xfrm>
+                                <a:prstGeom prst="rect">
+                                  <a:avLst/>
+                                </a:prstGeom>
+                              </pic:spPr>
+                            </pic:pic>
+                          </a:graphicData>
+                        </a:graphic>
+                      </wp:inline>
+                    </w:drawing>
+                  </w:r>
+                </w:p>
+              </w:tc>
+              <w:tc>
+                <w:tcPr>
+                  <w:tcW w:w="2139" w:type="dxa"/>
+                </w:tcPr>
+                <w:p>
+                  <w:pPr>
+                    <w:rPr>
+                      <w:rFonts w:ascii="Calibri" w:hAnsi="Calibri" w:cs="Calibri"/>
+                      <w:sz w:val="20"/>
+                      <w:szCs w:val="20"/>
+                    </w:rPr>
+                  </w:pPr>
+                  <w:r>
+                    <w:rPr>
+                      <w:rFonts w:ascii="Calibri" w:hAnsi="Calibri" w:cs="Calibri"/>
+                      <w:sz w:val="20"/>
+                      <w:szCs w:val="20"/>
+                    </w:rPr>
+                    <w:t>+91-904-1381-050</w:t>
+                  </w:r>
+                </w:p>
+              </w:tc>
+              <w:tc>
+                <w:tcPr>
+                  <w:tcW w:w="456" w:type="dxa"/>
+                </w:tcPr>
+                <w:p>
+                  <w:pPr>
+                    <w:rPr>
+                      <w:rFonts w:ascii="Calibri" w:hAnsi="Calibri" w:cs="Calibri"/>
+                      <w:sz w:val="20"/>
+                      <w:szCs w:val="20"/>
+                    </w:rPr>
+                  </w:pPr>
+                  <w:r>
+                    <w:rPr>
+                      <w:rFonts w:ascii="Calibri" w:hAnsi="Calibri" w:cs="Calibri"/>
+                      <w:b/>
+                      <w:noProof/>
+                      <w:sz w:val="20"/>
+                      <w:szCs w:val="20"/>
+                    </w:rPr>
+                    <w:drawing>
+                      <wp:inline distT="0" distB="0" distL="0" distR="0" wp14:anchorId="5A73DEBB" wp14:editId="2A348F37">
+                        <wp:extent cx="146050" cy="146050"/>
+                        <wp:effectExtent l="0" t="0" r="6350" b="6350"/>
+                        <wp:docPr id="1249126898" name="Graphic 16" descr="Email with solid fill"/>
+                        <wp:cNvGraphicFramePr>
+                          <a:graphicFrameLocks xmlns:a="http://schemas.openxmlformats.org/drawingml/2006/main" noChangeAspect="1"/>
+                        </wp:cNvGraphicFramePr>
+                        <a:graphic xmlns:a="http://schemas.openxmlformats.org/drawingml/2006/main">
+                          <a:graphicData uri="http://schemas.openxmlformats.org/drawingml/2006/picture">
+                            <pic:pic xmlns:pic="http://schemas.openxmlformats.org/drawingml/2006/picture">
+                              <pic:nvPicPr>
+                                <pic:cNvPr id="1249126898" name="Graphic 1249126898" descr="Email with solid fill"/>
+                                <pic:cNvPicPr/>
+                              </pic:nvPicPr>
+                              <pic:blipFill>
+                                <a:blip r:embed="rId7">
+                                  <a:extLst>
+                                    <a:ext uri="{96DAC541-7B7A-43D3-8B79-37D633B846F1}">
+                                      <asvg:svgBlip xmlns:asvg="http://schemas.microsoft.com/office/drawing/2016/SVG/main" r:embed="rId8"/>
+                                    </a:ext>
+                                  </a:extLst>
+                                </a:blip>
+                                <a:stretch>
+                                  <a:fillRect/>
+                                </a:stretch>
+                              </pic:blipFill>
+                              <pic:spPr>
+                                <a:xfrm>
+                                  <a:off x="0" y="0"/>
+                                  <a:ext cx="146050" cy="146050"/>
+                                </a:xfrm>
+                                <a:prstGeom prst="rect">
+                                  <a:avLst/>
+                                </a:prstGeom>
+                              </pic:spPr>
+                            </pic:pic>
+                          </a:graphicData>
+                        </a:graphic>
+                      </wp:inline>
+                    </w:drawing>
+                  </w:r>
+                </w:p>
+              </w:tc>
+              <w:tc>
+                <w:tcPr>
+                  <w:tcW w:w="3034" w:type="dxa"/>
+                </w:tcPr>
+                <w:p>
+                  <w:pPr>
+                    <w:rPr>
+                      <w:rFonts w:ascii="Calibri" w:hAnsi="Calibri" w:cs="Calibri"/>
+                      <w:sz w:val="20"/>
+                      <w:szCs w:val="20"/>
+                    </w:rPr>
+                  </w:pPr>
+                  <w:r>
+                    <w:rPr>
+                      <w:rFonts w:ascii="Calibri" w:hAnsi="Calibri" w:cs="Calibri"/>
+                      <w:sz w:val="20"/>
+                      <w:szCs w:val="20"/>
+                    </w:rPr>
+                    <w:t>t</w:t>
+                  </w:r>
+                  <w:r>
+                    <w:rPr>
+                      <w:rFonts w:ascii="Calibri" w:hAnsi="Calibri" w:cs="Calibri"/>
+                      <w:sz w:val="20"/>
+                      <w:szCs w:val="20"/>
+                    </w:rPr>
+                    <w:t>arunkuma07@gmail.com</w:t>
+                  </w:r>
+                </w:p>
+              </w:tc>
+            </w:tr>
+            <w:tr>
+              <w:tc>
+                <w:tcPr>
+                  <w:tcW w:w="566" w:type="dxa"/>
+                </w:tcPr>
+                <w:p>
+                  <w:pPr>
+                    <w:rPr>
+                      <w:rFonts w:ascii="Calibri" w:hAnsi="Calibri" w:cs="Calibri"/>
+                      <w:b/>
+                      <w:noProof/>
+                    </w:rPr>
+                  </w:pPr>
+                  <w:r>
+                    <w:rPr>
+                      <w:noProof/>
+                      <w14:ligatures w14:val="standardContextual"/>
+                    </w:rPr>
+                    <w:drawing>
+                      <wp:inline distT="0" distB="0" distL="0" distR="0" wp14:anchorId="1EF25385" wp14:editId="517AD90D">
+                        <wp:extent cx="215900" cy="215900"/>
+                        <wp:effectExtent l="0" t="0" r="6350" b="6350"/>
+                        <wp:docPr id="1962261040" name="Picture 11"/>
+                        <wp:cNvGraphicFramePr>
+                          <a:graphicFrameLocks xmlns:a="http://schemas.openxmlformats.org/drawingml/2006/main" noChangeAspect="1"/>
+                        </wp:cNvGraphicFramePr>
+                        <a:graphic xmlns:a="http://schemas.openxmlformats.org/drawingml/2006/main">
+                          <a:graphicData uri="http://schemas.openxmlformats.org/drawingml/2006/picture">
+                            <pic:pic xmlns:pic="http://schemas.openxmlformats.org/drawingml/2006/picture">
+                              <pic:nvPicPr>
+                                <pic:cNvPr id="1962261040" name="Picture 1962261040"/>
+                                <pic:cNvPicPr/>
+                              </pic:nvPicPr>
+                              <pic:blipFill>
+                                <a:blip r:embed="rId9">
+                                  <a:extLst>
+                                    <a:ext uri="{28A0092B-C50C-407E-A947-70E740481C1C}">
+                                      <a14:useLocalDpi xmlns:a14="http://schemas.microsoft.com/office/drawing/2010/main" val="0"/>
+                                    </a:ext>
+                                  </a:extLst>
+                                </a:blip>
+                                <a:stretch>
+                                  <a:fillRect/>
+                                </a:stretch>
+                              </pic:blipFill>
+                              <pic:spPr>
+                                <a:xfrm>
+                                  <a:off x="0" y="0"/>
+                                  <a:ext cx="215900" cy="215900"/>
+                                </a:xfrm>
+                                <a:prstGeom prst="rect">
+                                  <a:avLst/>
+                                </a:prstGeom>
+                              </pic:spPr>
+                            </pic:pic>
+                          </a:graphicData>
+                        </a:graphic>
+                      </wp:inline>
+                    </w:drawing>
+                  </w:r>
+                </w:p>
+              </w:tc>
+              <w:tc>
+                <w:tcPr>
+                  <w:tcW w:w="5629" w:type="dxa"/>
+                  <w:gridSpan w:val="3"/>
+                </w:tcPr>
+                <w:p>
+                  <w:pPr>
+                    <w:rPr>
+                      <w:rFonts w:ascii="Calibri" w:hAnsi="Calibri" w:cs="Calibri"/>
+                      <w:sz w:val="20"/>
+                      <w:szCs w:val="20"/>
+                    </w:rPr>
+                  </w:pPr>
+                  <w:r>
+                    <w:rPr>
+                      <w:rFonts w:ascii="Calibri" w:hAnsi="Calibri" w:cs="Calibri"/>
+                      <w:sz w:val="20"/>
+                      <w:szCs w:val="20"/>
+                    </w:rPr>
+                    <w:t>https://www.linkedin.com/in/tarun-kumar-5a113328/</w:t>
+                  </w:r>
+                </w:p>
+              </w:tc>
+            </w:tr>
+          </w:tbl>
           <w:p/>
           <w:p>
             <w:pPr>
@@ -2523,6 +2678,7 @@
                 <w:spacing w:val="-4"/>
               </w:rPr>
             </w:pPr>
+            <w:proofErr w:type="gramStart"/>
             <w:r>
               <w:rPr>
                 <w:rFonts w:ascii="Calibri" w:hAnsi="Calibri" w:cs="Calibri"/>
@@ -2531,6 +2687,7 @@
               </w:rPr>
               <w:t>Master in Computer Science</w:t>
             </w:r>
+            <w:proofErr w:type="gramEnd"/>
           </w:p>
           <w:p>
             <w:pPr>
@@ -2610,6 +2767,7 @@
                 <w:spacing w:val="-4"/>
               </w:rPr>
             </w:pPr>
+            <w:proofErr w:type="gramStart"/>
             <w:r>
               <w:rPr>
                 <w:rFonts w:ascii="Calibri" w:hAnsi="Calibri" w:cs="Calibri"/>
@@ -2618,6 +2776,7 @@
               </w:rPr>
               <w:t>Master in Computer Applications</w:t>
             </w:r>
+            <w:proofErr w:type="gramEnd"/>
           </w:p>
           <w:p>
             <w:pPr>
@@ -3147,6 +3306,7 @@
                       <w:szCs w:val="20"/>
                     </w:rPr>
                   </w:pPr>
+                  <w:proofErr w:type="spellStart"/>
                   <w:r>
                     <w:rPr>
                       <w:rFonts w:ascii="Calibri" w:hAnsi="Calibri" w:cs="Calibri"/>
@@ -3155,6 +3315,7 @@
                     </w:rPr>
                     <w:t>ReactJs</w:t>
                   </w:r>
+                  <w:proofErr w:type="spellEnd"/>
                 </w:p>
               </w:tc>
               <w:tc>
@@ -3281,6 +3442,57 @@
                       <w:szCs w:val="20"/>
                     </w:rPr>
                     <w:t>• • •</w:t>
+                  </w:r>
+                </w:p>
+              </w:tc>
+            </w:tr>
+            <w:tr>
+              <w:tc>
+                <w:tcPr>
+                  <w:tcW w:w="3258" w:type="dxa"/>
+                </w:tcPr>
+                <w:p>
+                  <w:pPr>
+                    <w:pStyle w:val="BodyText"/>
+                    <w:spacing w:before="28"/>
+                    <w:rPr>
+                      <w:rFonts w:ascii="Calibri" w:hAnsi="Calibri" w:cs="Calibri"/>
+                      <w:sz w:val="20"/>
+                      <w:szCs w:val="20"/>
+                    </w:rPr>
+                  </w:pPr>
+                  <w:r>
+                    <w:rPr>
+                      <w:rFonts w:ascii="Calibri" w:hAnsi="Calibri" w:cs="Calibri"/>
+                      <w:sz w:val="20"/>
+                      <w:szCs w:val="20"/>
+                    </w:rPr>
+                    <w:t>NoSQL</w:t>
+                  </w:r>
+                </w:p>
+              </w:tc>
+              <w:tc>
+                <w:tcPr>
+                  <w:tcW w:w="2484" w:type="dxa"/>
+                </w:tcPr>
+                <w:p>
+                  <w:pPr>
+                    <w:pStyle w:val="BodyText"/>
+                    <w:spacing w:before="28"/>
+                    <w:jc w:val="right"/>
+                    <w:rPr>
+                      <w:rFonts w:ascii="Calibri" w:hAnsi="Calibri" w:cs="Calibri"/>
+                      <w:sz w:val="20"/>
+                      <w:szCs w:val="20"/>
+                    </w:rPr>
+                  </w:pPr>
+                  <w:r>
+                    <w:rPr>
+                      <w:rFonts w:ascii="Calibri" w:hAnsi="Calibri" w:cs="Calibri"/>
+                      <w:sz w:val="20"/>
+                      <w:szCs w:val="20"/>
+                    </w:rPr>
+                    <w:t xml:space="preserve">• • </w:t>
                   </w:r>
                 </w:p>
               </w:tc>
@@ -3817,6 +4029,7 @@
                 <w:noProof/>
                 <w14:ligatures w14:val="standardContextual"/>
               </w:rPr>
+              <w:lastRenderedPageBreak/>
               <mc:AlternateContent>
                 <mc:Choice Requires="wps">
                   <w:drawing>
@@ -3935,8 +4148,19 @@
                       <w:sz w:val="20"/>
                       <w:szCs w:val="20"/>
                     </w:rPr>
-                    <w:t>Father’s Name :</w:t>
+                    <w:t xml:space="preserve">Father’s </w:t>
                   </w:r>
+                  <w:proofErr w:type="gramStart"/>
+                  <w:r>
+                    <w:rPr>
+                      <w:rFonts w:ascii="Calibri" w:hAnsi="Calibri" w:cs="Calibri"/>
+                      <w:spacing w:val="-4"/>
+                      <w:sz w:val="20"/>
+                      <w:szCs w:val="20"/>
+                    </w:rPr>
+                    <w:t>Name :</w:t>
+                  </w:r>
+                  <w:proofErr w:type="gramEnd"/>
                 </w:p>
               </w:tc>
               <w:tc>
@@ -3982,6 +4206,7 @@
                       <w:szCs w:val="20"/>
                     </w:rPr>
                   </w:pPr>
+                  <w:proofErr w:type="gramStart"/>
                   <w:r>
                     <w:rPr>
                       <w:rFonts w:ascii="Calibri" w:hAnsi="Calibri" w:cs="Calibri"/>
@@ -4009,6 +4234,7 @@
                     </w:rPr>
                     <w:t>:</w:t>
                   </w:r>
+                  <w:proofErr w:type="gramEnd"/>
                 </w:p>
               </w:tc>
               <w:tc>
@@ -4061,8 +4287,19 @@
                       <w:sz w:val="20"/>
                       <w:szCs w:val="20"/>
                     </w:rPr>
-                    <w:t>Marital Status  :</w:t>
+                    <w:t xml:space="preserve">Marital </w:t>
                   </w:r>
+                  <w:proofErr w:type="gramStart"/>
+                  <w:r>
+                    <w:rPr>
+                      <w:rFonts w:ascii="Calibri" w:hAnsi="Calibri" w:cs="Calibri"/>
+                      <w:spacing w:val="-4"/>
+                      <w:sz w:val="20"/>
+                      <w:szCs w:val="20"/>
+                    </w:rPr>
+                    <w:t>Status  :</w:t>
+                  </w:r>
+                  <w:proofErr w:type="gramEnd"/>
                 </w:p>
               </w:tc>
               <w:tc>
@@ -4115,8 +4352,19 @@
                       <w:sz w:val="20"/>
                       <w:szCs w:val="20"/>
                     </w:rPr>
-                    <w:t>Correspondence Address :</w:t>
+                    <w:t xml:space="preserve">Correspondence </w:t>
                   </w:r>
+                  <w:proofErr w:type="gramStart"/>
+                  <w:r>
+                    <w:rPr>
+                      <w:rFonts w:ascii="Calibri" w:hAnsi="Calibri" w:cs="Calibri"/>
+                      <w:spacing w:val="-4"/>
+                      <w:sz w:val="20"/>
+                      <w:szCs w:val="20"/>
+                    </w:rPr>
+                    <w:t>Address :</w:t>
+                  </w:r>
+                  <w:proofErr w:type="gramEnd"/>
                 </w:p>
               </w:tc>
               <w:tc>
@@ -4140,7 +4388,27 @@
                       <w:sz w:val="20"/>
                       <w:szCs w:val="20"/>
                     </w:rPr>
-                    <w:t>#1186, Kumaon Nagar, Nayagaon, S.A.S Nagar Mohali, Punjab 160103</w:t>
+                    <w:t xml:space="preserve">#1186, Kumaon Nagar, </w:t>
+                  </w:r>
+                  <w:proofErr w:type="spellStart"/>
+                  <w:r>
+                    <w:rPr>
+                      <w:rFonts w:ascii="Calibri" w:hAnsi="Calibri" w:cs="Calibri"/>
+                      <w:spacing w:val="-4"/>
+                      <w:sz w:val="20"/>
+                      <w:szCs w:val="20"/>
+                    </w:rPr>
+                    <w:t>Nayagaon</w:t>
+                  </w:r>
+                  <w:proofErr w:type="spellEnd"/>
+                  <w:r>
+                    <w:rPr>
+                      <w:rFonts w:ascii="Calibri" w:hAnsi="Calibri" w:cs="Calibri"/>
+                      <w:spacing w:val="-4"/>
+                      <w:sz w:val="20"/>
+                      <w:szCs w:val="20"/>
+                    </w:rPr>
+                    <w:t>, S.A.S Nagar Mohali, Punjab 160103</w:t>
                   </w:r>
                 </w:p>
               </w:tc>
@@ -4287,6 +4555,7 @@
                 <w:szCs w:val="20"/>
               </w:rPr>
             </w:pPr>
+            <w:proofErr w:type="gramStart"/>
             <w:r>
               <w:rPr>
                 <w:rFonts w:ascii="Calibri" w:hAnsi="Calibri" w:cs="Calibri"/>
@@ -4296,6 +4565,7 @@
               </w:rPr>
               <w:t>Date :</w:t>
             </w:r>
+            <w:proofErr w:type="gramEnd"/>
           </w:p>
           <w:p>
             <w:pPr>
@@ -4308,6 +4578,7 @@
                 <w:szCs w:val="20"/>
               </w:rPr>
             </w:pPr>
+            <w:proofErr w:type="gramStart"/>
             <w:r>
               <w:rPr>
                 <w:rFonts w:ascii="Calibri" w:hAnsi="Calibri" w:cs="Calibri"/>
@@ -4315,7 +4586,17 @@
                 <w:sz w:val="20"/>
                 <w:szCs w:val="20"/>
               </w:rPr>
-              <w:t>Place :                                                                                               (Signature)</w:t>
+              <w:t>Place :</w:t>
+            </w:r>
+            <w:proofErr w:type="gramEnd"/>
+            <w:r>
+              <w:rPr>
+                <w:rFonts w:ascii="Calibri" w:hAnsi="Calibri" w:cs="Calibri"/>
+                <w:bCs/>
+                <w:sz w:val="20"/>
+                <w:szCs w:val="20"/>
+              </w:rPr>
+              <w:t xml:space="preserve">                                                                                               (Signature)</w:t>
             </w:r>
           </w:p>
           <w:p>
@@ -4344,7 +4625,7 @@
         <mc:AlternateContent>
           <mc:Choice Requires="wps">
             <w:drawing>
-              <wp:anchor distT="0" distB="0" distL="0" distR="0" simplePos="0" relativeHeight="251659264" behindDoc="1" locked="0" layoutInCell="1" allowOverlap="1" wp14:anchorId="20324F13" wp14:editId="234B2661">
+              <wp:anchor distT="0" distB="0" distL="0" distR="0" simplePos="0" relativeHeight="251659264" behindDoc="1" locked="0" layoutInCell="1" allowOverlap="1" wp14:anchorId="20324F13" wp14:editId="43712889">
                 <wp:simplePos x="0" y="0"/>
                 <wp:positionH relativeFrom="page">
                   <wp:posOffset>8255</wp:posOffset>
@@ -4399,7 +4680,7 @@
                         </a:custGeom>
                         <a:solidFill>
                           <a:schemeClr val="bg1">
-                            <a:lumMod val="50000"/>
+                            <a:lumMod val="85000"/>
                           </a:schemeClr>
                         </a:solidFill>
                       </wps:spPr>
@@ -4420,7 +4701,7 @@
           </mc:Choice>
           <mc:Fallback>
             <w:pict>
-              <v:shape w14:anchorId="6E105244" id="Graphic 1" o:spid="_x0000_s1026" style="position:absolute;margin-left:.65pt;margin-top:-.3pt;width:249pt;height:841.95pt;z-index:-251657216;visibility:visible;mso-wrap-style:square;mso-width-percent:0;mso-wrap-distance-left:0;mso-wrap-distance-top:0;mso-wrap-distance-right:0;mso-wrap-distance-bottom:0;mso-position-horizontal:absolute;mso-position-horizontal-relative:page;mso-position-vertical:absolute;mso-position-vertical-relative:page;mso-width-percent:0;mso-width-relative:margin;v-text-anchor:top" coordsize="3019425,10692765" o:gfxdata="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" path="m,10692383l,,3019424,r,10692383l,10692383xe" fillcolor="#7f7f7f [1612]" stroked="f">
+              <v:shape w14:anchorId="238F2ABB" id="Graphic 1" o:spid="_x0000_s1026" style="position:absolute;margin-left:.65pt;margin-top:-.3pt;width:249pt;height:841.95pt;z-index:-251657216;visibility:visible;mso-wrap-style:square;mso-width-percent:0;mso-wrap-distance-left:0;mso-wrap-distance-top:0;mso-wrap-distance-right:0;mso-wrap-distance-bottom:0;mso-position-horizontal:absolute;mso-position-horizontal-relative:page;mso-position-vertical:absolute;mso-position-vertical-relative:page;mso-width-percent:0;mso-width-relative:margin;v-text-anchor:top" coordsize="3019425,10692765" o:gfxdata="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" path="m,10692383l,,3019424,r,10692383l,10692383xe" fillcolor="#d8d8d8 [2732]" stroked="f">
                 <v:path arrowok="t"/>
                 <w10:wrap anchorx="page" anchory="page"/>
               </v:shape>
@@ -4431,8 +4712,8 @@
     </w:p>
     <w:p/>
     <w:sectPr>
-      <w:pgSz w:w="12240" w:h="15840"/>
-      <w:pgMar w:top="540" w:right="1440" w:bottom="1440" w:left="1440" w:header="720" w:footer="720" w:gutter="0"/>
+      <w:pgSz w:w="11909" w:h="16834" w:code="9"/>
+      <w:pgMar w:top="547" w:right="1440" w:bottom="1440" w:left="1440" w:header="720" w:footer="720" w:gutter="0"/>
       <w:cols w:space="720"/>
       <w:docGrid w:linePitch="360"/>
     </w:sectPr>
@@ -5640,7 +5921,6 @@
   <w:style w:type="character" w:default="1" w:styleId="DefaultParagraphFont">
     <w:name w:val="Default Paragraph Font"/>
     <w:uiPriority w:val="1"/>
-    <w:semiHidden/>
     <w:unhideWhenUsed/>
   </w:style>
   <w:style w:type="table" w:default="1" w:styleId="TableNormal">
@@ -6006,6 +6286,18 @@
       <w:u w:val="single"/>
     </w:rPr>
   </w:style>
+  <w:style w:type="character" w:styleId="UnresolvedMention">
+    <w:name w:val="Unresolved Mention"/>
+    <w:basedOn w:val="DefaultParagraphFont"/>
+    <w:uiPriority w:val="99"/>
+    <w:semiHidden/>
+    <w:unhideWhenUsed/>
+    <w:rsid w:val="00096C59"/>
+    <w:rPr>
+      <w:color w:val="605E5C"/>
+      <w:shd w:val="clear" w:color="auto" w:fill="E1DFDD"/>
+    </w:rPr>
+  </w:style>
 </w:styles>
 </file>
 

</xml_diff>